<commit_message>
updated, Task 4 finished
</commit_message>
<xml_diff>
--- a/Yiwen_Deng_20721088.docx
+++ b/Yiwen_Deng_20721088.docx
@@ -77,9 +77,8 @@
         <w:rPr>
           <w:b/>
           <w:bCs/>
-          <w:color w:val="4472C4" w:themeColor="accent1"/>
-        </w:rPr>
-        <w:t>Add submission date here</w:t>
+        </w:rPr>
+        <w:t>03/05/2026</w:t>
       </w:r>
     </w:p>
     <w:p/>
@@ -105,13 +104,6 @@
           <w:color w:val="808080" w:themeColor="background1" w:themeShade="80"/>
         </w:rPr>
       </w:pPr>
-      <w:r>
-        <w:rPr>
-          <w:color w:val="808080" w:themeColor="background1" w:themeShade="80"/>
-        </w:rPr>
-        <w:lastRenderedPageBreak/>
-        <w:t>For questions which require you to write text (i.e., descriptive sentences), or include images and graphs, please add them to the Word submission template.</w:t>
-      </w:r>
     </w:p>
     <w:p>
       <w:pPr>
@@ -151,6 +143,39 @@
     <w:p>
       <w:pPr>
         <w:pStyle w:val="ListParagraph"/>
+      </w:pPr>
+      <w:r>
+        <w:t xml:space="preserve">Repository link: </w:t>
+      </w:r>
+      <w:hyperlink r:id="rId8" w:history="1">
+        <w:r>
+          <w:rPr>
+            <w:rStyle w:val="Hyperlink"/>
+          </w:rPr>
+          <w:t>https://github.com/Yiwen1088/CW1</w:t>
+        </w:r>
+        <w:r>
+          <w:rPr>
+            <w:rStyle w:val="Hyperlink"/>
+          </w:rPr>
+          <w:t>0</w:t>
+        </w:r>
+        <w:r>
+          <w:rPr>
+            <w:rStyle w:val="Hyperlink"/>
+          </w:rPr>
+          <w:t>05.git</w:t>
+        </w:r>
+      </w:hyperlink>
+    </w:p>
+    <w:p>
+      <w:pPr>
+        <w:pStyle w:val="ListParagraph"/>
+      </w:pPr>
+    </w:p>
+    <w:p>
+      <w:pPr>
+        <w:pStyle w:val="ListParagraph"/>
         <w:numPr>
           <w:ilvl w:val="0"/>
           <w:numId w:val="8"/>
@@ -163,7 +188,7 @@
     <w:tbl>
       <w:tblPr>
         <w:tblStyle w:val="TableGrid"/>
-        <w:tblW w:w="8995" w:type="dxa"/>
+        <w:tblW w:w="4459" w:type="dxa"/>
         <w:tblBorders>
           <w:top w:val="none" w:sz="0" w:space="0" w:color="auto"/>
           <w:left w:val="none" w:sz="0" w:space="0" w:color="auto"/>
@@ -172,6 +197,7 @@
           <w:insideH w:val="none" w:sz="0" w:space="0" w:color="auto"/>
           <w:insideV w:val="none" w:sz="0" w:space="0" w:color="auto"/>
         </w:tblBorders>
+        <w:shd w:val="clear" w:color="auto" w:fill="FFFFFF" w:themeFill="background1"/>
         <w:tblLook w:val="04A0" w:firstRow="1" w:lastRow="0" w:firstColumn="1" w:lastColumn="0" w:noHBand="0" w:noVBand="1"/>
       </w:tblPr>
       <w:tblGrid>
@@ -179,11 +205,12 @@
       </w:tblGrid>
       <w:tr>
         <w:trPr>
-          <w:trHeight w:val="6508"/>
+          <w:trHeight w:val="3604"/>
         </w:trPr>
         <w:tc>
           <w:tcPr>
-            <w:tcW w:w="8995" w:type="dxa"/>
+            <w:tcW w:w="4459" w:type="dxa"/>
+            <w:shd w:val="clear" w:color="auto" w:fill="FFFFFF" w:themeFill="background1"/>
           </w:tcPr>
           <w:p>
             <w:pPr>
@@ -215,7 +242,7 @@
                           <pic:cNvPicPr/>
                         </pic:nvPicPr>
                         <pic:blipFill>
-                          <a:blip r:embed="rId8" cstate="print">
+                          <a:blip r:embed="rId9" cstate="print">
                             <a:extLst>
                               <a:ext uri="{28A0092B-C50C-407E-A947-70E740481C1C}">
                                 <a14:useLocalDpi xmlns:a14="http://schemas.microsoft.com/office/drawing/2010/main" val="0"/>
@@ -244,6 +271,38 @@
           </w:p>
         </w:tc>
       </w:tr>
+      <w:tr>
+        <w:trPr>
+          <w:trHeight w:val="403"/>
+        </w:trPr>
+        <w:tc>
+          <w:tcPr>
+            <w:tcW w:w="4459" w:type="dxa"/>
+            <w:shd w:val="clear" w:color="auto" w:fill="FFFFFF" w:themeFill="background1"/>
+          </w:tcPr>
+          <w:p>
+            <w:pPr>
+              <w:spacing w:line="259" w:lineRule="auto"/>
+              <w:jc w:val="center"/>
+              <w:rPr>
+                <w:rFonts w:eastAsia="DengXian"/>
+                <w:noProof/>
+                <w:color w:val="000000" w:themeColor="text1"/>
+                <w:lang w:eastAsia="zh-CN"/>
+              </w:rPr>
+            </w:pPr>
+            <w:r>
+              <w:rPr>
+                <w:rFonts w:eastAsia="DengXian" w:hint="eastAsia"/>
+                <w:noProof/>
+                <w:color w:val="000000" w:themeColor="text1"/>
+                <w:lang w:eastAsia="zh-CN"/>
+              </w:rPr>
+              <w:t>Figure 1. Connection for Preliminary Task</w:t>
+            </w:r>
+          </w:p>
+        </w:tc>
+      </w:tr>
     </w:tbl>
     <w:p>
       <w:pPr>
@@ -337,48 +396,39 @@
     </w:p>
     <w:p>
       <w:pPr>
-        <w:spacing w:line="259" w:lineRule="auto"/>
-        <w:jc w:val="both"/>
-        <w:rPr>
-          <w:color w:val="000000" w:themeColor="text1"/>
-          <w:highlight w:val="cyan"/>
-        </w:rPr>
-      </w:pPr>
-    </w:p>
-    <w:p>
-      <w:pPr>
-        <w:spacing w:line="259" w:lineRule="auto"/>
-        <w:jc w:val="both"/>
-        <w:rPr>
-          <w:color w:val="000000" w:themeColor="text1"/>
-          <w:highlight w:val="cyan"/>
-        </w:rPr>
-      </w:pPr>
-    </w:p>
-    <w:p>
-      <w:pPr>
         <w:rPr>
           <w:b/>
           <w:bCs/>
         </w:rPr>
       </w:pPr>
-      <w:r>
+    </w:p>
+    <w:p>
+      <w:pPr>
         <w:rPr>
           <w:b/>
           <w:bCs/>
         </w:rPr>
-        <w:lastRenderedPageBreak/>
+      </w:pPr>
+      <w:r>
+        <w:rPr>
+          <w:b/>
+          <w:bCs/>
+        </w:rPr>
         <w:t>Task 1</w:t>
       </w:r>
     </w:p>
     <w:p>
       <w:pPr>
-        <w:pStyle w:val="ListParagraph"/>
-        <w:numPr>
-          <w:ilvl w:val="0"/>
-          <w:numId w:val="10"/>
-        </w:numPr>
-      </w:pPr>
+        <w:rPr>
+          <w:b/>
+          <w:bCs/>
+        </w:rPr>
+      </w:pPr>
+    </w:p>
+    <w:p>
+      <w:r>
+        <w:t xml:space="preserve">a) </w:t>
+      </w:r>
       <w:r>
         <w:t>photograph of the connection of temperature sensor</w:t>
       </w:r>
@@ -386,7 +436,8 @@
     <w:tbl>
       <w:tblPr>
         <w:tblStyle w:val="TableGrid"/>
-        <w:tblW w:w="9246" w:type="dxa"/>
+        <w:tblW w:w="11772" w:type="dxa"/>
+        <w:jc w:val="center"/>
         <w:tblBorders>
           <w:top w:val="none" w:sz="0" w:space="0" w:color="auto"/>
           <w:left w:val="none" w:sz="0" w:space="0" w:color="auto"/>
@@ -398,20 +449,201 @@
         <w:tblLook w:val="04A0" w:firstRow="1" w:lastRow="0" w:firstColumn="1" w:lastColumn="0" w:noHBand="0" w:noVBand="1"/>
       </w:tblPr>
       <w:tblGrid>
-        <w:gridCol w:w="9246"/>
+        <w:gridCol w:w="5886"/>
+        <w:gridCol w:w="5886"/>
       </w:tblGrid>
       <w:tr>
         <w:trPr>
-          <w:trHeight w:val="3653"/>
+          <w:trHeight w:hRule="exact" w:val="3418"/>
+          <w:jc w:val="center"/>
         </w:trPr>
         <w:tc>
           <w:tcPr>
-            <w:tcW w:w="9246" w:type="dxa"/>
+            <w:tcW w:w="5886" w:type="dxa"/>
           </w:tcPr>
           <w:p>
             <w:pPr>
               <w:spacing w:line="259" w:lineRule="auto"/>
-              <w:jc w:val="both"/>
+              <w:jc w:val="center"/>
+              <w:rPr>
+                <w:color w:val="000000" w:themeColor="text1"/>
+                <w:highlight w:val="cyan"/>
+              </w:rPr>
+            </w:pPr>
+            <w:r>
+              <w:rPr>
+                <w:noProof/>
+                <w:color w:val="000000" w:themeColor="text1"/>
+              </w:rPr>
+              <w:drawing>
+                <wp:inline distT="0" distB="0" distL="0" distR="0" wp14:anchorId="1AB8E546" wp14:editId="02E1E894">
+                  <wp:extent cx="2880000" cy="2160000"/>
+                  <wp:effectExtent l="0" t="0" r="0" b="0"/>
+                  <wp:docPr id="1400172780" name="Picture 5"/>
+                  <wp:cNvGraphicFramePr>
+                    <a:graphicFrameLocks xmlns:a="http://schemas.openxmlformats.org/drawingml/2006/main" noChangeAspect="1"/>
+                  </wp:cNvGraphicFramePr>
+                  <a:graphic xmlns:a="http://schemas.openxmlformats.org/drawingml/2006/main">
+                    <a:graphicData uri="http://schemas.openxmlformats.org/drawingml/2006/picture">
+                      <pic:pic xmlns:pic="http://schemas.openxmlformats.org/drawingml/2006/picture">
+                        <pic:nvPicPr>
+                          <pic:cNvPr id="1400172780" name="Picture 1400172780"/>
+                          <pic:cNvPicPr/>
+                        </pic:nvPicPr>
+                        <pic:blipFill>
+                          <a:blip r:embed="rId10" cstate="print">
+                            <a:extLst>
+                              <a:ext uri="{28A0092B-C50C-407E-A947-70E740481C1C}">
+                                <a14:useLocalDpi xmlns:a14="http://schemas.microsoft.com/office/drawing/2010/main" val="0"/>
+                              </a:ext>
+                            </a:extLst>
+                          </a:blip>
+                          <a:stretch>
+                            <a:fillRect/>
+                          </a:stretch>
+                        </pic:blipFill>
+                        <pic:spPr>
+                          <a:xfrm>
+                            <a:off x="0" y="0"/>
+                            <a:ext cx="2880000" cy="2160000"/>
+                          </a:xfrm>
+                          <a:prstGeom prst="rect">
+                            <a:avLst/>
+                          </a:prstGeom>
+                        </pic:spPr>
+                      </pic:pic>
+                    </a:graphicData>
+                  </a:graphic>
+                </wp:inline>
+              </w:drawing>
+            </w:r>
+          </w:p>
+        </w:tc>
+        <w:tc>
+          <w:tcPr>
+            <w:tcW w:w="5886" w:type="dxa"/>
+          </w:tcPr>
+          <w:p>
+            <w:pPr>
+              <w:spacing w:line="259" w:lineRule="auto"/>
+              <w:jc w:val="center"/>
+              <w:rPr>
+                <w:color w:val="000000" w:themeColor="text1"/>
+                <w:highlight w:val="cyan"/>
+              </w:rPr>
+            </w:pPr>
+            <w:r>
+              <w:rPr>
+                <w:noProof/>
+                <w:color w:val="000000" w:themeColor="text1"/>
+              </w:rPr>
+              <w:drawing>
+                <wp:inline distT="0" distB="0" distL="0" distR="0" wp14:anchorId="4131D5F2" wp14:editId="3B6CDEF3">
+                  <wp:extent cx="2880000" cy="2160000"/>
+                  <wp:effectExtent l="0" t="0" r="0" b="0"/>
+                  <wp:docPr id="173268652" name="Picture 4"/>
+                  <wp:cNvGraphicFramePr>
+                    <a:graphicFrameLocks xmlns:a="http://schemas.openxmlformats.org/drawingml/2006/main" noChangeAspect="1"/>
+                  </wp:cNvGraphicFramePr>
+                  <a:graphic xmlns:a="http://schemas.openxmlformats.org/drawingml/2006/main">
+                    <a:graphicData uri="http://schemas.openxmlformats.org/drawingml/2006/picture">
+                      <pic:pic xmlns:pic="http://schemas.openxmlformats.org/drawingml/2006/picture">
+                        <pic:nvPicPr>
+                          <pic:cNvPr id="173268652" name="Picture 173268652"/>
+                          <pic:cNvPicPr/>
+                        </pic:nvPicPr>
+                        <pic:blipFill>
+                          <a:blip r:embed="rId11" cstate="print">
+                            <a:extLst>
+                              <a:ext uri="{28A0092B-C50C-407E-A947-70E740481C1C}">
+                                <a14:useLocalDpi xmlns:a14="http://schemas.microsoft.com/office/drawing/2010/main" val="0"/>
+                              </a:ext>
+                            </a:extLst>
+                          </a:blip>
+                          <a:stretch>
+                            <a:fillRect/>
+                          </a:stretch>
+                        </pic:blipFill>
+                        <pic:spPr>
+                          <a:xfrm>
+                            <a:off x="0" y="0"/>
+                            <a:ext cx="2880000" cy="2160000"/>
+                          </a:xfrm>
+                          <a:prstGeom prst="rect">
+                            <a:avLst/>
+                          </a:prstGeom>
+                        </pic:spPr>
+                      </pic:pic>
+                    </a:graphicData>
+                  </a:graphic>
+                </wp:inline>
+              </w:drawing>
+            </w:r>
+          </w:p>
+        </w:tc>
+      </w:tr>
+      <w:tr>
+        <w:trPr>
+          <w:trHeight w:val="256"/>
+          <w:jc w:val="center"/>
+        </w:trPr>
+        <w:tc>
+          <w:tcPr>
+            <w:tcW w:w="5886" w:type="dxa"/>
+          </w:tcPr>
+          <w:p>
+            <w:pPr>
+              <w:spacing w:line="259" w:lineRule="auto"/>
+              <w:jc w:val="center"/>
+              <w:rPr>
+                <w:rFonts w:eastAsia="DengXian"/>
+                <w:noProof/>
+                <w:color w:val="000000" w:themeColor="text1"/>
+                <w:lang w:eastAsia="zh-CN"/>
+              </w:rPr>
+            </w:pPr>
+            <w:r>
+              <w:rPr>
+                <w:rFonts w:eastAsia="DengXian"/>
+                <w:noProof/>
+                <w:color w:val="000000" w:themeColor="text1"/>
+                <w:lang w:eastAsia="zh-CN"/>
+              </w:rPr>
+              <w:t>Figure 2.</w:t>
+            </w:r>
+            <w:r>
+              <w:rPr>
+                <w:rFonts w:eastAsia="DengXian"/>
+                <w:noProof/>
+                <w:color w:val="000000" w:themeColor="text1"/>
+                <w:lang w:eastAsia="zh-CN"/>
+              </w:rPr>
+              <w:t xml:space="preserve"> </w:t>
+            </w:r>
+            <w:r>
+              <w:rPr>
+                <w:rFonts w:eastAsia="DengXian"/>
+                <w:noProof/>
+                <w:color w:val="000000" w:themeColor="text1"/>
+                <w:lang w:eastAsia="zh-CN"/>
+              </w:rPr>
+              <w:t>First connection without resistor</w:t>
+            </w:r>
+          </w:p>
+          <w:p>
+            <w:pPr>
+              <w:spacing w:line="259" w:lineRule="auto"/>
+              <w:jc w:val="center"/>
+              <w:rPr>
+                <w:color w:val="000000" w:themeColor="text1"/>
+                <w:highlight w:val="cyan"/>
+              </w:rPr>
+            </w:pPr>
+          </w:p>
+          <w:p>
+            <w:pPr>
+              <w:spacing w:line="259" w:lineRule="auto"/>
+              <w:jc w:val="center"/>
               <w:rPr>
                 <w:color w:val="000000" w:themeColor="text1"/>
                 <w:highlight w:val="cyan"/>
@@ -419,6 +651,235 @@
             </w:pPr>
           </w:p>
         </w:tc>
+        <w:tc>
+          <w:tcPr>
+            <w:tcW w:w="5886" w:type="dxa"/>
+          </w:tcPr>
+          <w:p>
+            <w:pPr>
+              <w:spacing w:line="259" w:lineRule="auto"/>
+              <w:jc w:val="center"/>
+              <w:rPr>
+                <w:color w:val="000000" w:themeColor="text1"/>
+                <w:highlight w:val="cyan"/>
+              </w:rPr>
+            </w:pPr>
+            <w:r>
+              <w:rPr>
+                <w:rFonts w:eastAsia="DengXian"/>
+                <w:noProof/>
+                <w:color w:val="000000" w:themeColor="text1"/>
+                <w:lang w:eastAsia="zh-CN"/>
+              </w:rPr>
+              <w:t>Figure 3.</w:t>
+            </w:r>
+            <w:r>
+              <w:rPr>
+                <w:rFonts w:eastAsia="DengXian"/>
+                <w:noProof/>
+                <w:color w:val="000000" w:themeColor="text1"/>
+                <w:lang w:eastAsia="zh-CN"/>
+              </w:rPr>
+              <w:t xml:space="preserve"> Second connection with a resistor</w:t>
+            </w:r>
+          </w:p>
+        </w:tc>
+      </w:tr>
+      <w:tr>
+        <w:trPr>
+          <w:trHeight w:val="256"/>
+          <w:jc w:val="center"/>
+        </w:trPr>
+        <w:tc>
+          <w:tcPr>
+            <w:tcW w:w="5886" w:type="dxa"/>
+          </w:tcPr>
+          <w:p>
+            <w:pPr>
+              <w:spacing w:line="259" w:lineRule="auto"/>
+              <w:jc w:val="center"/>
+              <w:rPr>
+                <w:rFonts w:eastAsia="DengXian"/>
+                <w:noProof/>
+                <w:color w:val="000000" w:themeColor="text1"/>
+                <w:lang w:eastAsia="zh-CN"/>
+              </w:rPr>
+            </w:pPr>
+            <w:r>
+              <w:rPr>
+                <w:rFonts w:eastAsia="DengXian"/>
+                <w:noProof/>
+                <w:color w:val="000000" w:themeColor="text1"/>
+                <w:lang w:eastAsia="zh-CN"/>
+              </w:rPr>
+              <w:drawing>
+                <wp:inline distT="0" distB="0" distL="0" distR="0" wp14:anchorId="3F238DF8" wp14:editId="46D20C94">
+                  <wp:extent cx="3600000" cy="2343600"/>
+                  <wp:effectExtent l="0" t="0" r="635" b="0"/>
+                  <wp:docPr id="1900240056" name="Picture 6"/>
+                  <wp:cNvGraphicFramePr>
+                    <a:graphicFrameLocks xmlns:a="http://schemas.openxmlformats.org/drawingml/2006/main" noChangeAspect="1"/>
+                  </wp:cNvGraphicFramePr>
+                  <a:graphic xmlns:a="http://schemas.openxmlformats.org/drawingml/2006/main">
+                    <a:graphicData uri="http://schemas.openxmlformats.org/drawingml/2006/picture">
+                      <pic:pic xmlns:pic="http://schemas.openxmlformats.org/drawingml/2006/picture">
+                        <pic:nvPicPr>
+                          <pic:cNvPr id="1900240056" name="Picture 1900240056"/>
+                          <pic:cNvPicPr/>
+                        </pic:nvPicPr>
+                        <pic:blipFill>
+                          <a:blip r:embed="rId12" cstate="print">
+                            <a:extLst>
+                              <a:ext uri="{28A0092B-C50C-407E-A947-70E740481C1C}">
+                                <a14:useLocalDpi xmlns:a14="http://schemas.microsoft.com/office/drawing/2010/main" val="0"/>
+                              </a:ext>
+                            </a:extLst>
+                          </a:blip>
+                          <a:stretch>
+                            <a:fillRect/>
+                          </a:stretch>
+                        </pic:blipFill>
+                        <pic:spPr>
+                          <a:xfrm>
+                            <a:off x="0" y="0"/>
+                            <a:ext cx="3600000" cy="2343600"/>
+                          </a:xfrm>
+                          <a:prstGeom prst="rect">
+                            <a:avLst/>
+                          </a:prstGeom>
+                        </pic:spPr>
+                      </pic:pic>
+                    </a:graphicData>
+                  </a:graphic>
+                </wp:inline>
+              </w:drawing>
+            </w:r>
+          </w:p>
+        </w:tc>
+        <w:tc>
+          <w:tcPr>
+            <w:tcW w:w="5886" w:type="dxa"/>
+          </w:tcPr>
+          <w:p>
+            <w:pPr>
+              <w:spacing w:line="259" w:lineRule="auto"/>
+              <w:jc w:val="center"/>
+              <w:rPr>
+                <w:rFonts w:eastAsia="DengXian"/>
+                <w:noProof/>
+                <w:color w:val="000000" w:themeColor="text1"/>
+                <w:lang w:eastAsia="zh-CN"/>
+              </w:rPr>
+            </w:pPr>
+            <w:r>
+              <w:rPr>
+                <w:rFonts w:eastAsia="DengXian"/>
+                <w:noProof/>
+                <w:color w:val="000000" w:themeColor="text1"/>
+                <w:lang w:eastAsia="zh-CN"/>
+              </w:rPr>
+              <w:drawing>
+                <wp:inline distT="0" distB="0" distL="0" distR="0" wp14:anchorId="7A9EF409" wp14:editId="2FA422A6">
+                  <wp:extent cx="3600000" cy="2343600"/>
+                  <wp:effectExtent l="0" t="0" r="635" b="0"/>
+                  <wp:docPr id="1314451059" name="Picture 8"/>
+                  <wp:cNvGraphicFramePr>
+                    <a:graphicFrameLocks xmlns:a="http://schemas.openxmlformats.org/drawingml/2006/main" noChangeAspect="1"/>
+                  </wp:cNvGraphicFramePr>
+                  <a:graphic xmlns:a="http://schemas.openxmlformats.org/drawingml/2006/main">
+                    <a:graphicData uri="http://schemas.openxmlformats.org/drawingml/2006/picture">
+                      <pic:pic xmlns:pic="http://schemas.openxmlformats.org/drawingml/2006/picture">
+                        <pic:nvPicPr>
+                          <pic:cNvPr id="1314451059" name="Picture 1314451059"/>
+                          <pic:cNvPicPr/>
+                        </pic:nvPicPr>
+                        <pic:blipFill>
+                          <a:blip r:embed="rId13" cstate="print">
+                            <a:extLst>
+                              <a:ext uri="{28A0092B-C50C-407E-A947-70E740481C1C}">
+                                <a14:useLocalDpi xmlns:a14="http://schemas.microsoft.com/office/drawing/2010/main" val="0"/>
+                              </a:ext>
+                            </a:extLst>
+                          </a:blip>
+                          <a:stretch>
+                            <a:fillRect/>
+                          </a:stretch>
+                        </pic:blipFill>
+                        <pic:spPr>
+                          <a:xfrm>
+                            <a:off x="0" y="0"/>
+                            <a:ext cx="3600000" cy="2343600"/>
+                          </a:xfrm>
+                          <a:prstGeom prst="rect">
+                            <a:avLst/>
+                          </a:prstGeom>
+                        </pic:spPr>
+                      </pic:pic>
+                    </a:graphicData>
+                  </a:graphic>
+                </wp:inline>
+              </w:drawing>
+            </w:r>
+          </w:p>
+        </w:tc>
+      </w:tr>
+      <w:tr>
+        <w:trPr>
+          <w:trHeight w:val="256"/>
+          <w:jc w:val="center"/>
+        </w:trPr>
+        <w:tc>
+          <w:tcPr>
+            <w:tcW w:w="5886" w:type="dxa"/>
+          </w:tcPr>
+          <w:p>
+            <w:pPr>
+              <w:spacing w:line="259" w:lineRule="auto"/>
+              <w:jc w:val="center"/>
+              <w:rPr>
+                <w:rFonts w:eastAsia="DengXian"/>
+                <w:noProof/>
+                <w:color w:val="000000" w:themeColor="text1"/>
+                <w:lang w:eastAsia="zh-CN"/>
+              </w:rPr>
+            </w:pPr>
+            <w:r>
+              <w:rPr>
+                <w:rFonts w:eastAsia="DengXian"/>
+                <w:noProof/>
+                <w:color w:val="000000" w:themeColor="text1"/>
+                <w:lang w:eastAsia="zh-CN"/>
+              </w:rPr>
+              <w:t>Figure 4. The plot image of first connection</w:t>
+            </w:r>
+          </w:p>
+        </w:tc>
+        <w:tc>
+          <w:tcPr>
+            <w:tcW w:w="5886" w:type="dxa"/>
+          </w:tcPr>
+          <w:p>
+            <w:pPr>
+              <w:spacing w:line="259" w:lineRule="auto"/>
+              <w:jc w:val="center"/>
+              <w:rPr>
+                <w:rFonts w:eastAsia="DengXian"/>
+                <w:noProof/>
+                <w:color w:val="000000" w:themeColor="text1"/>
+                <w:lang w:eastAsia="zh-CN"/>
+              </w:rPr>
+            </w:pPr>
+            <w:r>
+              <w:rPr>
+                <w:rFonts w:eastAsia="DengXian" w:hint="eastAsia"/>
+                <w:noProof/>
+                <w:color w:val="000000" w:themeColor="text1"/>
+                <w:lang w:eastAsia="zh-CN"/>
+              </w:rPr>
+              <w:t>Figure 5. The plot image of second connection</w:t>
+            </w:r>
+          </w:p>
+        </w:tc>
       </w:tr>
     </w:tbl>
     <w:p>
@@ -438,6 +899,7 @@
         <w:rPr>
           <w:color w:val="000000" w:themeColor="text1"/>
           <w:highlight w:val="cyan"/>
+          <w:lang w:eastAsia="zh-CN"/>
         </w:rPr>
       </w:pPr>
     </w:p>
@@ -515,23 +977,535 @@
     </w:p>
     <w:p>
       <w:pPr>
+        <w:rPr>
+          <w:b/>
+          <w:bCs/>
+        </w:rPr>
+      </w:pPr>
+    </w:p>
+    <w:p>
+      <w:pPr>
+        <w:rPr>
+          <w:b/>
+          <w:bCs/>
+          <w:lang w:eastAsia="zh-CN"/>
+        </w:rPr>
+      </w:pPr>
+      <w:r>
+        <w:rPr>
+          <w:b/>
+          <w:bCs/>
+        </w:rPr>
+        <w:t xml:space="preserve">Task </w:t>
+      </w:r>
+      <w:r>
+        <w:rPr>
+          <w:rFonts w:hint="eastAsia"/>
+          <w:b/>
+          <w:bCs/>
+          <w:lang w:eastAsia="zh-CN"/>
+        </w:rPr>
+        <w:t>2</w:t>
+      </w:r>
+    </w:p>
+    <w:p/>
+    <w:p>
+      <w:r>
+        <w:t>f</w:t>
+      </w:r>
+      <w:r>
+        <w:t xml:space="preserve">) </w:t>
+      </w:r>
+      <w:r>
+        <w:t>photograph of the connection for Task 2</w:t>
+      </w:r>
+    </w:p>
+    <w:tbl>
+      <w:tblPr>
+        <w:tblStyle w:val="TableGrid"/>
+        <w:tblW w:w="0" w:type="auto"/>
+        <w:tblBorders>
+          <w:top w:val="none" w:sz="0" w:space="0" w:color="auto"/>
+          <w:left w:val="none" w:sz="0" w:space="0" w:color="auto"/>
+          <w:bottom w:val="none" w:sz="0" w:space="0" w:color="auto"/>
+          <w:right w:val="none" w:sz="0" w:space="0" w:color="auto"/>
+          <w:insideH w:val="none" w:sz="0" w:space="0" w:color="auto"/>
+          <w:insideV w:val="none" w:sz="0" w:space="0" w:color="auto"/>
+        </w:tblBorders>
+        <w:tblLook w:val="04A0" w:firstRow="1" w:lastRow="0" w:firstColumn="1" w:lastColumn="0" w:noHBand="0" w:noVBand="1"/>
+      </w:tblPr>
+      <w:tblGrid>
+        <w:gridCol w:w="9026"/>
+      </w:tblGrid>
+      <w:tr>
+        <w:tc>
+          <w:tcPr>
+            <w:tcW w:w="9026" w:type="dxa"/>
+          </w:tcPr>
+          <w:p>
+            <w:pPr>
+              <w:jc w:val="center"/>
+            </w:pPr>
+            <w:r>
+              <w:rPr>
+                <w:noProof/>
+              </w:rPr>
+              <w:drawing>
+                <wp:inline distT="0" distB="0" distL="0" distR="0" wp14:anchorId="3056A462" wp14:editId="35525932">
+                  <wp:extent cx="5731510" cy="4298950"/>
+                  <wp:effectExtent l="0" t="0" r="2540" b="6350"/>
+                  <wp:docPr id="1639455797" name="Picture 4"/>
+                  <wp:cNvGraphicFramePr>
+                    <a:graphicFrameLocks xmlns:a="http://schemas.openxmlformats.org/drawingml/2006/main" noChangeAspect="1"/>
+                  </wp:cNvGraphicFramePr>
+                  <a:graphic xmlns:a="http://schemas.openxmlformats.org/drawingml/2006/main">
+                    <a:graphicData uri="http://schemas.openxmlformats.org/drawingml/2006/picture">
+                      <pic:pic xmlns:pic="http://schemas.openxmlformats.org/drawingml/2006/picture">
+                        <pic:nvPicPr>
+                          <pic:cNvPr id="1639455797" name="Picture 1639455797"/>
+                          <pic:cNvPicPr/>
+                        </pic:nvPicPr>
+                        <pic:blipFill>
+                          <a:blip r:embed="rId14" cstate="print">
+                            <a:extLst>
+                              <a:ext uri="{28A0092B-C50C-407E-A947-70E740481C1C}">
+                                <a14:useLocalDpi xmlns:a14="http://schemas.microsoft.com/office/drawing/2010/main" val="0"/>
+                              </a:ext>
+                            </a:extLst>
+                          </a:blip>
+                          <a:stretch>
+                            <a:fillRect/>
+                          </a:stretch>
+                        </pic:blipFill>
+                        <pic:spPr>
+                          <a:xfrm>
+                            <a:off x="0" y="0"/>
+                            <a:ext cx="5731510" cy="4298950"/>
+                          </a:xfrm>
+                          <a:prstGeom prst="rect">
+                            <a:avLst/>
+                          </a:prstGeom>
+                        </pic:spPr>
+                      </pic:pic>
+                    </a:graphicData>
+                  </a:graphic>
+                </wp:inline>
+              </w:drawing>
+            </w:r>
+          </w:p>
+        </w:tc>
+      </w:tr>
+      <w:tr>
+        <w:tc>
+          <w:tcPr>
+            <w:tcW w:w="9026" w:type="dxa"/>
+          </w:tcPr>
+          <w:p>
+            <w:pPr>
+              <w:jc w:val="center"/>
+            </w:pPr>
+            <w:r>
+              <w:t>Figure 6. Connection for Task 2</w:t>
+            </w:r>
+          </w:p>
+        </w:tc>
+      </w:tr>
+    </w:tbl>
+    <w:p/>
+    <w:p/>
+    <w:p/>
+    <w:p/>
+    <w:p/>
+    <w:p/>
+    <w:p/>
+    <w:p/>
+    <w:p/>
+    <w:p/>
+    <w:p>
+      <w:r>
+        <w:lastRenderedPageBreak/>
+        <w:t>g)</w:t>
+      </w:r>
+      <w:r>
+        <w:t xml:space="preserve"> first flowchart</w:t>
+      </w:r>
+    </w:p>
+    <w:tbl>
+      <w:tblPr>
+        <w:tblStyle w:val="TableGrid"/>
+        <w:tblW w:w="0" w:type="auto"/>
+        <w:tblBorders>
+          <w:top w:val="none" w:sz="0" w:space="0" w:color="auto"/>
+          <w:left w:val="none" w:sz="0" w:space="0" w:color="auto"/>
+          <w:bottom w:val="none" w:sz="0" w:space="0" w:color="auto"/>
+          <w:right w:val="none" w:sz="0" w:space="0" w:color="auto"/>
+          <w:insideH w:val="none" w:sz="0" w:space="0" w:color="auto"/>
+          <w:insideV w:val="none" w:sz="0" w:space="0" w:color="auto"/>
+        </w:tblBorders>
+        <w:tblLook w:val="04A0" w:firstRow="1" w:lastRow="0" w:firstColumn="1" w:lastColumn="0" w:noHBand="0" w:noVBand="1"/>
+      </w:tblPr>
+      <w:tblGrid>
+        <w:gridCol w:w="9016"/>
+      </w:tblGrid>
+      <w:tr>
+        <w:tc>
+          <w:tcPr>
+            <w:tcW w:w="9016" w:type="dxa"/>
+          </w:tcPr>
+          <w:p>
+            <w:pPr>
+              <w:jc w:val="center"/>
+            </w:pPr>
+            <w:r>
+              <w:rPr>
+                <w:noProof/>
+              </w:rPr>
+              <w:drawing>
+                <wp:inline distT="0" distB="0" distL="0" distR="0" wp14:anchorId="23DA1EDB" wp14:editId="5A22C66E">
+                  <wp:extent cx="5579107" cy="4790049"/>
+                  <wp:effectExtent l="0" t="0" r="3175" b="0"/>
+                  <wp:docPr id="1666211812" name="Picture 5"/>
+                  <wp:cNvGraphicFramePr>
+                    <a:graphicFrameLocks xmlns:a="http://schemas.openxmlformats.org/drawingml/2006/main" noChangeAspect="1"/>
+                  </wp:cNvGraphicFramePr>
+                  <a:graphic xmlns:a="http://schemas.openxmlformats.org/drawingml/2006/main">
+                    <a:graphicData uri="http://schemas.openxmlformats.org/drawingml/2006/picture">
+                      <pic:pic xmlns:pic="http://schemas.openxmlformats.org/drawingml/2006/picture">
+                        <pic:nvPicPr>
+                          <pic:cNvPr id="1666211812" name="Picture 1666211812"/>
+                          <pic:cNvPicPr/>
+                        </pic:nvPicPr>
+                        <pic:blipFill>
+                          <a:blip r:embed="rId15">
+                            <a:extLst>
+                              <a:ext uri="{28A0092B-C50C-407E-A947-70E740481C1C}">
+                                <a14:useLocalDpi xmlns:a14="http://schemas.microsoft.com/office/drawing/2010/main" val="0"/>
+                              </a:ext>
+                            </a:extLst>
+                          </a:blip>
+                          <a:stretch>
+                            <a:fillRect/>
+                          </a:stretch>
+                        </pic:blipFill>
+                        <pic:spPr>
+                          <a:xfrm>
+                            <a:off x="0" y="0"/>
+                            <a:ext cx="5586566" cy="4796453"/>
+                          </a:xfrm>
+                          <a:prstGeom prst="rect">
+                            <a:avLst/>
+                          </a:prstGeom>
+                        </pic:spPr>
+                      </pic:pic>
+                    </a:graphicData>
+                  </a:graphic>
+                </wp:inline>
+              </w:drawing>
+            </w:r>
+          </w:p>
+        </w:tc>
+      </w:tr>
+      <w:tr>
+        <w:tc>
+          <w:tcPr>
+            <w:tcW w:w="9016" w:type="dxa"/>
+          </w:tcPr>
+          <w:p>
+            <w:pPr>
+              <w:jc w:val="center"/>
+            </w:pPr>
+            <w:r>
+              <w:t>Figure 7. First flowchart for Task 2</w:t>
+            </w:r>
+          </w:p>
+        </w:tc>
+      </w:tr>
+    </w:tbl>
+    <w:p>
+      <w:pPr>
         <w:spacing w:line="259" w:lineRule="auto"/>
         <w:jc w:val="both"/>
-        <w:rPr>
-          <w:color w:val="000000" w:themeColor="text1"/>
-          <w:highlight w:val="cyan"/>
-        </w:rPr>
       </w:pPr>
     </w:p>
     <w:p>
       <w:pPr>
         <w:spacing w:line="259" w:lineRule="auto"/>
         <w:jc w:val="both"/>
-        <w:rPr>
-          <w:color w:val="000000" w:themeColor="text1"/>
-          <w:highlight w:val="cyan"/>
-        </w:rPr>
-      </w:pPr>
+      </w:pPr>
+      <w:proofErr w:type="spellStart"/>
+      <w:r>
+        <w:t>i</w:t>
+      </w:r>
+      <w:proofErr w:type="spellEnd"/>
+      <w:r>
+        <w:t xml:space="preserve">) </w:t>
+      </w:r>
+      <w:r>
+        <w:t>snapshots of the plot in Task 2</w:t>
+      </w:r>
+    </w:p>
+    <w:tbl>
+      <w:tblPr>
+        <w:tblStyle w:val="TableGrid"/>
+        <w:tblW w:w="11771" w:type="dxa"/>
+        <w:jc w:val="center"/>
+        <w:tblBorders>
+          <w:top w:val="none" w:sz="0" w:space="0" w:color="auto"/>
+          <w:left w:val="none" w:sz="0" w:space="0" w:color="auto"/>
+          <w:bottom w:val="none" w:sz="0" w:space="0" w:color="auto"/>
+          <w:right w:val="none" w:sz="0" w:space="0" w:color="auto"/>
+          <w:insideH w:val="none" w:sz="0" w:space="0" w:color="auto"/>
+          <w:insideV w:val="none" w:sz="0" w:space="0" w:color="auto"/>
+        </w:tblBorders>
+        <w:tblLook w:val="04A0" w:firstRow="1" w:lastRow="0" w:firstColumn="1" w:lastColumn="0" w:noHBand="0" w:noVBand="1"/>
+      </w:tblPr>
+      <w:tblGrid>
+        <w:gridCol w:w="5886"/>
+        <w:gridCol w:w="5886"/>
+      </w:tblGrid>
+      <w:tr>
+        <w:trPr>
+          <w:jc w:val="center"/>
+        </w:trPr>
+        <w:tc>
+          <w:tcPr>
+            <w:tcW w:w="4508" w:type="dxa"/>
+          </w:tcPr>
+          <w:p>
+            <w:pPr>
+              <w:spacing w:line="259" w:lineRule="auto"/>
+              <w:jc w:val="center"/>
+            </w:pPr>
+            <w:r>
+              <w:rPr>
+                <w:noProof/>
+              </w:rPr>
+              <w:drawing>
+                <wp:inline distT="0" distB="0" distL="0" distR="0" wp14:anchorId="0F28E753" wp14:editId="748CECCB">
+                  <wp:extent cx="3600000" cy="2401200"/>
+                  <wp:effectExtent l="0" t="0" r="635" b="0"/>
+                  <wp:docPr id="228060353" name="Picture 6"/>
+                  <wp:cNvGraphicFramePr>
+                    <a:graphicFrameLocks xmlns:a="http://schemas.openxmlformats.org/drawingml/2006/main" noChangeAspect="1"/>
+                  </wp:cNvGraphicFramePr>
+                  <a:graphic xmlns:a="http://schemas.openxmlformats.org/drawingml/2006/main">
+                    <a:graphicData uri="http://schemas.openxmlformats.org/drawingml/2006/picture">
+                      <pic:pic xmlns:pic="http://schemas.openxmlformats.org/drawingml/2006/picture">
+                        <pic:nvPicPr>
+                          <pic:cNvPr id="228060353" name="Picture 228060353"/>
+                          <pic:cNvPicPr/>
+                        </pic:nvPicPr>
+                        <pic:blipFill>
+                          <a:blip r:embed="rId16" cstate="print">
+                            <a:extLst>
+                              <a:ext uri="{28A0092B-C50C-407E-A947-70E740481C1C}">
+                                <a14:useLocalDpi xmlns:a14="http://schemas.microsoft.com/office/drawing/2010/main" val="0"/>
+                              </a:ext>
+                            </a:extLst>
+                          </a:blip>
+                          <a:stretch>
+                            <a:fillRect/>
+                          </a:stretch>
+                        </pic:blipFill>
+                        <pic:spPr>
+                          <a:xfrm>
+                            <a:off x="0" y="0"/>
+                            <a:ext cx="3600000" cy="2401200"/>
+                          </a:xfrm>
+                          <a:prstGeom prst="rect">
+                            <a:avLst/>
+                          </a:prstGeom>
+                        </pic:spPr>
+                      </pic:pic>
+                    </a:graphicData>
+                  </a:graphic>
+                </wp:inline>
+              </w:drawing>
+            </w:r>
+          </w:p>
+        </w:tc>
+        <w:tc>
+          <w:tcPr>
+            <w:tcW w:w="4508" w:type="dxa"/>
+          </w:tcPr>
+          <w:p>
+            <w:pPr>
+              <w:spacing w:line="259" w:lineRule="auto"/>
+              <w:jc w:val="center"/>
+            </w:pPr>
+            <w:r>
+              <w:rPr>
+                <w:noProof/>
+              </w:rPr>
+              <w:drawing>
+                <wp:inline distT="0" distB="0" distL="0" distR="0" wp14:anchorId="4F78EAD3" wp14:editId="13CB2D13">
+                  <wp:extent cx="3600000" cy="2401200"/>
+                  <wp:effectExtent l="0" t="0" r="635" b="0"/>
+                  <wp:docPr id="268104621" name="Picture 8"/>
+                  <wp:cNvGraphicFramePr>
+                    <a:graphicFrameLocks xmlns:a="http://schemas.openxmlformats.org/drawingml/2006/main" noChangeAspect="1"/>
+                  </wp:cNvGraphicFramePr>
+                  <a:graphic xmlns:a="http://schemas.openxmlformats.org/drawingml/2006/main">
+                    <a:graphicData uri="http://schemas.openxmlformats.org/drawingml/2006/picture">
+                      <pic:pic xmlns:pic="http://schemas.openxmlformats.org/drawingml/2006/picture">
+                        <pic:nvPicPr>
+                          <pic:cNvPr id="268104621" name="Picture 268104621"/>
+                          <pic:cNvPicPr/>
+                        </pic:nvPicPr>
+                        <pic:blipFill>
+                          <a:blip r:embed="rId17" cstate="print">
+                            <a:extLst>
+                              <a:ext uri="{28A0092B-C50C-407E-A947-70E740481C1C}">
+                                <a14:useLocalDpi xmlns:a14="http://schemas.microsoft.com/office/drawing/2010/main" val="0"/>
+                              </a:ext>
+                            </a:extLst>
+                          </a:blip>
+                          <a:stretch>
+                            <a:fillRect/>
+                          </a:stretch>
+                        </pic:blipFill>
+                        <pic:spPr>
+                          <a:xfrm>
+                            <a:off x="0" y="0"/>
+                            <a:ext cx="3600000" cy="2401200"/>
+                          </a:xfrm>
+                          <a:prstGeom prst="rect">
+                            <a:avLst/>
+                          </a:prstGeom>
+                        </pic:spPr>
+                      </pic:pic>
+                    </a:graphicData>
+                  </a:graphic>
+                </wp:inline>
+              </w:drawing>
+            </w:r>
+          </w:p>
+        </w:tc>
+      </w:tr>
+      <w:tr>
+        <w:trPr>
+          <w:jc w:val="center"/>
+        </w:trPr>
+        <w:tc>
+          <w:tcPr>
+            <w:tcW w:w="4508" w:type="dxa"/>
+          </w:tcPr>
+          <w:p>
+            <w:pPr>
+              <w:spacing w:line="259" w:lineRule="auto"/>
+              <w:jc w:val="center"/>
+            </w:pPr>
+            <w:r>
+              <w:t>Figure 8. A snapshot of the plot</w:t>
+            </w:r>
+          </w:p>
+        </w:tc>
+        <w:tc>
+          <w:tcPr>
+            <w:tcW w:w="4508" w:type="dxa"/>
+          </w:tcPr>
+          <w:p>
+            <w:pPr>
+              <w:spacing w:line="259" w:lineRule="auto"/>
+              <w:jc w:val="center"/>
+            </w:pPr>
+            <w:r>
+              <w:t>Figure 9. Another snapshot when</w:t>
+            </w:r>
+            <w:r>
+              <w:t xml:space="preserve"> my</w:t>
+            </w:r>
+            <w:r>
+              <w:t xml:space="preserve"> hand held </w:t>
+            </w:r>
+            <w:r>
+              <w:t xml:space="preserve">the </w:t>
+            </w:r>
+            <w:r>
+              <w:t>sensor</w:t>
+            </w:r>
+          </w:p>
+        </w:tc>
+      </w:tr>
+    </w:tbl>
+    <w:p>
+      <w:pPr>
+        <w:spacing w:line="240" w:lineRule="auto"/>
+      </w:pPr>
+    </w:p>
+    <w:p>
+      <w:pPr>
+        <w:spacing w:line="240" w:lineRule="auto"/>
+        <w:rPr>
+          <w:rFonts w:ascii="Consolas" w:eastAsia="DengXian" w:hAnsi="Consolas" w:cs="Times New Roman"/>
+          <w:sz w:val="20"/>
+          <w:szCs w:val="20"/>
+          <w:lang w:eastAsia="zh-CN"/>
+        </w:rPr>
+      </w:pPr>
+      <w:r>
+        <w:rPr>
+          <w:rFonts w:hint="eastAsia"/>
+        </w:rPr>
+        <w:lastRenderedPageBreak/>
+        <w:t>l)</w:t>
+      </w:r>
+      <w:r>
+        <w:rPr>
+          <w:rFonts w:hint="eastAsia"/>
+          <w:lang w:eastAsia="zh-CN"/>
+        </w:rPr>
+        <w:t xml:space="preserve"> </w:t>
+      </w:r>
+      <w:r>
+        <w:rPr>
+          <w:rFonts w:hint="eastAsia"/>
+          <w:lang w:eastAsia="zh-CN"/>
+        </w:rPr>
+        <w:t xml:space="preserve"> Copy of description from MATLAB</w:t>
+      </w:r>
+      <w:r>
+        <w:rPr>
+          <w:rFonts w:hint="eastAsia"/>
+          <w:lang w:eastAsia="zh-CN"/>
+        </w:rPr>
+        <w:t xml:space="preserve"> retrieved file using </w:t>
+      </w:r>
+      <w:r>
+        <w:rPr>
+          <w:lang w:eastAsia="zh-CN"/>
+        </w:rPr>
+        <w:t>‘</w:t>
+      </w:r>
+      <w:r>
+        <w:rPr>
+          <w:rFonts w:hint="eastAsia"/>
+          <w:lang w:eastAsia="zh-CN"/>
+        </w:rPr>
+        <w:t xml:space="preserve">doc </w:t>
+      </w:r>
+      <w:proofErr w:type="spellStart"/>
+      <w:r>
+        <w:rPr>
+          <w:rFonts w:hint="eastAsia"/>
+          <w:lang w:eastAsia="zh-CN"/>
+        </w:rPr>
+        <w:t>temp_monitor</w:t>
+      </w:r>
+      <w:proofErr w:type="spellEnd"/>
+      <w:r>
+        <w:rPr>
+          <w:lang w:eastAsia="zh-CN"/>
+        </w:rPr>
+        <w:t>’</w:t>
+      </w:r>
+      <w:r>
+        <w:rPr>
+          <w:rFonts w:hint="eastAsia"/>
+          <w:lang w:eastAsia="zh-CN"/>
+        </w:rPr>
+        <w:t xml:space="preserve"> command:</w:t>
+      </w:r>
     </w:p>
     <w:p>
       <w:pPr>
@@ -549,9 +1523,14 @@
         <w:jc w:val="both"/>
         <w:rPr>
           <w:color w:val="000000" w:themeColor="text1"/>
-          <w:highlight w:val="cyan"/>
-        </w:rPr>
-      </w:pPr>
+        </w:rPr>
+      </w:pPr>
+      <w:r>
+        <w:rPr>
+          <w:color w:val="000000" w:themeColor="text1"/>
+        </w:rPr>
+        <w:t>This is a function to collect temperature values based on the read</w:t>
+      </w:r>
     </w:p>
     <w:p>
       <w:pPr>
@@ -559,9 +1538,14 @@
         <w:jc w:val="both"/>
         <w:rPr>
           <w:color w:val="000000" w:themeColor="text1"/>
-          <w:highlight w:val="cyan"/>
-        </w:rPr>
-      </w:pPr>
+        </w:rPr>
+      </w:pPr>
+      <w:r>
+        <w:rPr>
+          <w:color w:val="000000" w:themeColor="text1"/>
+        </w:rPr>
+        <w:t xml:space="preserve">  voltage, and control 3 LEDs of different colours (green, yellow and red)</w:t>
+      </w:r>
     </w:p>
     <w:p>
       <w:pPr>
@@ -569,9 +1553,14 @@
         <w:jc w:val="both"/>
         <w:rPr>
           <w:color w:val="000000" w:themeColor="text1"/>
-          <w:highlight w:val="cyan"/>
-        </w:rPr>
-      </w:pPr>
+        </w:rPr>
+      </w:pPr>
+      <w:r>
+        <w:rPr>
+          <w:color w:val="000000" w:themeColor="text1"/>
+        </w:rPr>
+        <w:t xml:space="preserve">  to light or blink in real-time according to the temperature with a live </w:t>
+      </w:r>
     </w:p>
     <w:p>
       <w:pPr>
@@ -579,9 +1568,14 @@
         <w:jc w:val="both"/>
         <w:rPr>
           <w:color w:val="000000" w:themeColor="text1"/>
-          <w:highlight w:val="cyan"/>
-        </w:rPr>
-      </w:pPr>
+        </w:rPr>
+      </w:pPr>
+      <w:r>
+        <w:rPr>
+          <w:color w:val="000000" w:themeColor="text1"/>
+        </w:rPr>
+        <w:t xml:space="preserve">  graph. When the temperature is in the range 18 °C to 24 °C, the green LED</w:t>
+      </w:r>
     </w:p>
     <w:p>
       <w:pPr>
@@ -589,9 +1583,14 @@
         <w:jc w:val="both"/>
         <w:rPr>
           <w:color w:val="000000" w:themeColor="text1"/>
-          <w:highlight w:val="cyan"/>
-        </w:rPr>
-      </w:pPr>
+        </w:rPr>
+      </w:pPr>
+      <w:r>
+        <w:rPr>
+          <w:color w:val="000000" w:themeColor="text1"/>
+        </w:rPr>
+        <w:t xml:space="preserve">  will light constantly. The yellow LED will blink while temperature is </w:t>
+      </w:r>
     </w:p>
     <w:p>
       <w:pPr>
@@ -602,6 +1601,12 @@
           <w:highlight w:val="cyan"/>
         </w:rPr>
       </w:pPr>
+      <w:r>
+        <w:rPr>
+          <w:color w:val="000000" w:themeColor="text1"/>
+        </w:rPr>
+        <w:t xml:space="preserve">  lower and the red LED will blink while temperature is above the range</w:t>
+      </w:r>
     </w:p>
     <w:p>
       <w:pPr>
@@ -617,12 +1622,119 @@
       <w:pPr>
         <w:spacing w:line="259" w:lineRule="auto"/>
         <w:jc w:val="both"/>
-        <w:rPr>
-          <w:color w:val="000000" w:themeColor="text1"/>
-          <w:highlight w:val="cyan"/>
-        </w:rPr>
-      </w:pPr>
-    </w:p>
+      </w:pPr>
+      <w:r>
+        <w:t xml:space="preserve">m) </w:t>
+      </w:r>
+      <w:r>
+        <w:t>second flowchart</w:t>
+      </w:r>
+    </w:p>
+    <w:tbl>
+      <w:tblPr>
+        <w:tblStyle w:val="TableGrid"/>
+        <w:tblW w:w="0" w:type="auto"/>
+        <w:tblBorders>
+          <w:top w:val="none" w:sz="0" w:space="0" w:color="auto"/>
+          <w:left w:val="none" w:sz="0" w:space="0" w:color="auto"/>
+          <w:bottom w:val="none" w:sz="0" w:space="0" w:color="auto"/>
+          <w:right w:val="none" w:sz="0" w:space="0" w:color="auto"/>
+          <w:insideH w:val="none" w:sz="0" w:space="0" w:color="auto"/>
+          <w:insideV w:val="none" w:sz="0" w:space="0" w:color="auto"/>
+        </w:tblBorders>
+        <w:tblLook w:val="04A0" w:firstRow="1" w:lastRow="0" w:firstColumn="1" w:lastColumn="0" w:noHBand="0" w:noVBand="1"/>
+      </w:tblPr>
+      <w:tblGrid>
+        <w:gridCol w:w="9016"/>
+      </w:tblGrid>
+      <w:tr>
+        <w:tc>
+          <w:tcPr>
+            <w:tcW w:w="9016" w:type="dxa"/>
+          </w:tcPr>
+          <w:p>
+            <w:pPr>
+              <w:spacing w:line="259" w:lineRule="auto"/>
+              <w:jc w:val="center"/>
+              <w:rPr>
+                <w:color w:val="000000" w:themeColor="text1"/>
+                <w:highlight w:val="cyan"/>
+              </w:rPr>
+            </w:pPr>
+            <w:r>
+              <w:rPr>
+                <w:noProof/>
+                <w:color w:val="000000" w:themeColor="text1"/>
+              </w:rPr>
+              <w:drawing>
+                <wp:inline distT="0" distB="0" distL="0" distR="0" wp14:anchorId="12703508" wp14:editId="411B07AB">
+                  <wp:extent cx="5515902" cy="4262510"/>
+                  <wp:effectExtent l="0" t="0" r="8890" b="5080"/>
+                  <wp:docPr id="2084216130" name="Picture 3"/>
+                  <wp:cNvGraphicFramePr>
+                    <a:graphicFrameLocks xmlns:a="http://schemas.openxmlformats.org/drawingml/2006/main" noChangeAspect="1"/>
+                  </wp:cNvGraphicFramePr>
+                  <a:graphic xmlns:a="http://schemas.openxmlformats.org/drawingml/2006/main">
+                    <a:graphicData uri="http://schemas.openxmlformats.org/drawingml/2006/picture">
+                      <pic:pic xmlns:pic="http://schemas.openxmlformats.org/drawingml/2006/picture">
+                        <pic:nvPicPr>
+                          <pic:cNvPr id="2084216130" name="Picture 2084216130"/>
+                          <pic:cNvPicPr/>
+                        </pic:nvPicPr>
+                        <pic:blipFill>
+                          <a:blip r:embed="rId18">
+                            <a:extLst>
+                              <a:ext uri="{28A0092B-C50C-407E-A947-70E740481C1C}">
+                                <a14:useLocalDpi xmlns:a14="http://schemas.microsoft.com/office/drawing/2010/main" val="0"/>
+                              </a:ext>
+                            </a:extLst>
+                          </a:blip>
+                          <a:stretch>
+                            <a:fillRect/>
+                          </a:stretch>
+                        </pic:blipFill>
+                        <pic:spPr>
+                          <a:xfrm>
+                            <a:off x="0" y="0"/>
+                            <a:ext cx="5521354" cy="4266723"/>
+                          </a:xfrm>
+                          <a:prstGeom prst="rect">
+                            <a:avLst/>
+                          </a:prstGeom>
+                        </pic:spPr>
+                      </pic:pic>
+                    </a:graphicData>
+                  </a:graphic>
+                </wp:inline>
+              </w:drawing>
+            </w:r>
+          </w:p>
+        </w:tc>
+      </w:tr>
+      <w:tr>
+        <w:tc>
+          <w:tcPr>
+            <w:tcW w:w="9016" w:type="dxa"/>
+          </w:tcPr>
+          <w:p>
+            <w:pPr>
+              <w:spacing w:line="259" w:lineRule="auto"/>
+              <w:jc w:val="center"/>
+              <w:rPr>
+                <w:color w:val="000000" w:themeColor="text1"/>
+                <w:highlight w:val="cyan"/>
+              </w:rPr>
+            </w:pPr>
+            <w:r>
+              <w:t xml:space="preserve">Figure </w:t>
+            </w:r>
+            <w:r>
+              <w:t>10. Second flowchart for Task 2</w:t>
+            </w:r>
+          </w:p>
+        </w:tc>
+      </w:tr>
+    </w:tbl>
     <w:p>
       <w:pPr>
         <w:spacing w:line="259" w:lineRule="auto"/>
@@ -695,21 +1807,162 @@
     </w:p>
     <w:p>
       <w:pPr>
+        <w:rPr>
+          <w:b/>
+          <w:bCs/>
+        </w:rPr>
+      </w:pPr>
+      <w:r>
+        <w:rPr>
+          <w:rFonts w:hint="eastAsia"/>
+          <w:b/>
+          <w:bCs/>
+        </w:rPr>
+        <w:t>Task 3</w:t>
+      </w:r>
+    </w:p>
+    <w:p>
+      <w:pPr>
         <w:spacing w:line="259" w:lineRule="auto"/>
         <w:jc w:val="both"/>
         <w:rPr>
           <w:color w:val="000000" w:themeColor="text1"/>
-          <w:highlight w:val="cyan"/>
-        </w:rPr>
-      </w:pPr>
-    </w:p>
+        </w:rPr>
+      </w:pPr>
+      <w:r>
+        <w:rPr>
+          <w:color w:val="000000" w:themeColor="text1"/>
+        </w:rPr>
+        <w:t>a)</w:t>
+      </w:r>
+      <w:r>
+        <w:rPr>
+          <w:color w:val="000000" w:themeColor="text1"/>
+        </w:rPr>
+        <w:t xml:space="preserve"> flowchart</w:t>
+      </w:r>
+    </w:p>
+    <w:tbl>
+      <w:tblPr>
+        <w:tblStyle w:val="TableGrid"/>
+        <w:tblW w:w="0" w:type="auto"/>
+        <w:tblBorders>
+          <w:top w:val="none" w:sz="0" w:space="0" w:color="auto"/>
+          <w:left w:val="none" w:sz="0" w:space="0" w:color="auto"/>
+          <w:bottom w:val="none" w:sz="0" w:space="0" w:color="auto"/>
+          <w:right w:val="none" w:sz="0" w:space="0" w:color="auto"/>
+          <w:insideH w:val="none" w:sz="0" w:space="0" w:color="auto"/>
+          <w:insideV w:val="none" w:sz="0" w:space="0" w:color="auto"/>
+        </w:tblBorders>
+        <w:tblLook w:val="04A0" w:firstRow="1" w:lastRow="0" w:firstColumn="1" w:lastColumn="0" w:noHBand="0" w:noVBand="1"/>
+      </w:tblPr>
+      <w:tblGrid>
+        <w:gridCol w:w="9026"/>
+      </w:tblGrid>
+      <w:tr>
+        <w:tc>
+          <w:tcPr>
+            <w:tcW w:w="9016" w:type="dxa"/>
+          </w:tcPr>
+          <w:p>
+            <w:pPr>
+              <w:spacing w:line="259" w:lineRule="auto"/>
+              <w:jc w:val="center"/>
+              <w:rPr>
+                <w:color w:val="000000" w:themeColor="text1"/>
+              </w:rPr>
+            </w:pPr>
+            <w:r>
+              <w:rPr>
+                <w:noProof/>
+                <w:color w:val="000000" w:themeColor="text1"/>
+              </w:rPr>
+              <w:drawing>
+                <wp:inline distT="0" distB="0" distL="0" distR="0" wp14:anchorId="2F8BFCAE" wp14:editId="26DE8A3C">
+                  <wp:extent cx="5595394" cy="4670474"/>
+                  <wp:effectExtent l="0" t="0" r="5715" b="0"/>
+                  <wp:docPr id="1111165436" name="Picture 3"/>
+                  <wp:cNvGraphicFramePr>
+                    <a:graphicFrameLocks xmlns:a="http://schemas.openxmlformats.org/drawingml/2006/main" noChangeAspect="1"/>
+                  </wp:cNvGraphicFramePr>
+                  <a:graphic xmlns:a="http://schemas.openxmlformats.org/drawingml/2006/main">
+                    <a:graphicData uri="http://schemas.openxmlformats.org/drawingml/2006/picture">
+                      <pic:pic xmlns:pic="http://schemas.openxmlformats.org/drawingml/2006/picture">
+                        <pic:nvPicPr>
+                          <pic:cNvPr id="1111165436" name="Picture 1111165436"/>
+                          <pic:cNvPicPr/>
+                        </pic:nvPicPr>
+                        <pic:blipFill>
+                          <a:blip r:embed="rId19">
+                            <a:extLst>
+                              <a:ext uri="{28A0092B-C50C-407E-A947-70E740481C1C}">
+                                <a14:useLocalDpi xmlns:a14="http://schemas.microsoft.com/office/drawing/2010/main" val="0"/>
+                              </a:ext>
+                            </a:extLst>
+                          </a:blip>
+                          <a:stretch>
+                            <a:fillRect/>
+                          </a:stretch>
+                        </pic:blipFill>
+                        <pic:spPr>
+                          <a:xfrm>
+                            <a:off x="0" y="0"/>
+                            <a:ext cx="5600176" cy="4674466"/>
+                          </a:xfrm>
+                          <a:prstGeom prst="rect">
+                            <a:avLst/>
+                          </a:prstGeom>
+                        </pic:spPr>
+                      </pic:pic>
+                    </a:graphicData>
+                  </a:graphic>
+                </wp:inline>
+              </w:drawing>
+            </w:r>
+          </w:p>
+        </w:tc>
+      </w:tr>
+      <w:tr>
+        <w:tc>
+          <w:tcPr>
+            <w:tcW w:w="9016" w:type="dxa"/>
+          </w:tcPr>
+          <w:p>
+            <w:pPr>
+              <w:spacing w:line="259" w:lineRule="auto"/>
+              <w:jc w:val="center"/>
+              <w:rPr>
+                <w:color w:val="000000" w:themeColor="text1"/>
+              </w:rPr>
+            </w:pPr>
+            <w:r>
+              <w:rPr>
+                <w:color w:val="000000" w:themeColor="text1"/>
+              </w:rPr>
+              <w:t xml:space="preserve">Figure </w:t>
+            </w:r>
+            <w:r>
+              <w:rPr>
+                <w:color w:val="000000" w:themeColor="text1"/>
+              </w:rPr>
+              <w:t>11</w:t>
+            </w:r>
+            <w:r>
+              <w:rPr>
+                <w:color w:val="000000" w:themeColor="text1"/>
+              </w:rPr>
+              <w:t>. Flowchart for Task 3</w:t>
+            </w:r>
+          </w:p>
+        </w:tc>
+      </w:tr>
+    </w:tbl>
     <w:p>
       <w:pPr>
         <w:spacing w:line="259" w:lineRule="auto"/>
         <w:jc w:val="both"/>
         <w:rPr>
           <w:color w:val="000000" w:themeColor="text1"/>
-          <w:highlight w:val="cyan"/>
         </w:rPr>
       </w:pPr>
     </w:p>
@@ -719,9 +1972,45 @@
         <w:jc w:val="both"/>
         <w:rPr>
           <w:color w:val="000000" w:themeColor="text1"/>
-          <w:highlight w:val="cyan"/>
-        </w:rPr>
-      </w:pPr>
+        </w:rPr>
+      </w:pPr>
+      <w:r>
+        <w:rPr>
+          <w:rFonts w:hint="eastAsia"/>
+          <w:color w:val="000000" w:themeColor="text1"/>
+          <w:lang w:eastAsia="zh-CN"/>
+        </w:rPr>
+        <w:t>e</w:t>
+      </w:r>
+      <w:r>
+        <w:rPr>
+          <w:color w:val="000000" w:themeColor="text1"/>
+        </w:rPr>
+        <w:t xml:space="preserve">)  Copy of description from MATLAB retrieved file using ‘doc </w:t>
+      </w:r>
+      <w:proofErr w:type="spellStart"/>
+      <w:r>
+        <w:rPr>
+          <w:rFonts w:hint="eastAsia"/>
+          <w:color w:val="000000" w:themeColor="text1"/>
+          <w:lang w:eastAsia="zh-CN"/>
+        </w:rPr>
+        <w:t>temp_prediction</w:t>
+      </w:r>
+      <w:proofErr w:type="spellEnd"/>
+      <w:r>
+        <w:rPr>
+          <w:color w:val="000000" w:themeColor="text1"/>
+          <w:lang w:eastAsia="zh-CN"/>
+        </w:rPr>
+        <w:t>’</w:t>
+      </w:r>
+      <w:r>
+        <w:rPr>
+          <w:color w:val="000000" w:themeColor="text1"/>
+        </w:rPr>
+        <w:t xml:space="preserve"> command:</w:t>
+      </w:r>
     </w:p>
     <w:p>
       <w:pPr>
@@ -729,15 +2018,458 @@
         <w:jc w:val="both"/>
         <w:rPr>
           <w:color w:val="000000" w:themeColor="text1"/>
+        </w:rPr>
+      </w:pPr>
+    </w:p>
+    <w:p>
+      <w:pPr>
+        <w:spacing w:line="259" w:lineRule="auto"/>
+        <w:jc w:val="both"/>
+        <w:rPr>
+          <w:color w:val="000000" w:themeColor="text1"/>
+        </w:rPr>
+      </w:pPr>
+      <w:r>
+        <w:rPr>
+          <w:color w:val="000000" w:themeColor="text1"/>
+        </w:rPr>
+        <w:t>This is a function to collect temperature values based on the read</w:t>
+      </w:r>
+    </w:p>
+    <w:p>
+      <w:pPr>
+        <w:spacing w:line="259" w:lineRule="auto"/>
+        <w:jc w:val="both"/>
+        <w:rPr>
+          <w:color w:val="000000" w:themeColor="text1"/>
+        </w:rPr>
+      </w:pPr>
+      <w:r>
+        <w:rPr>
+          <w:color w:val="000000" w:themeColor="text1"/>
+        </w:rPr>
+        <w:t xml:space="preserve">  voltage, and calculate how fast the temperature change continuously. Then</w:t>
+      </w:r>
+    </w:p>
+    <w:p>
+      <w:pPr>
+        <w:spacing w:line="259" w:lineRule="auto"/>
+        <w:jc w:val="both"/>
+        <w:rPr>
+          <w:color w:val="000000" w:themeColor="text1"/>
+        </w:rPr>
+      </w:pPr>
+      <w:r>
+        <w:rPr>
+          <w:color w:val="000000" w:themeColor="text1"/>
+        </w:rPr>
+        <w:t xml:space="preserve">  the temperature expected in minutes is predicted. 3 LEDs of different </w:t>
+      </w:r>
+    </w:p>
+    <w:p>
+      <w:pPr>
+        <w:spacing w:line="259" w:lineRule="auto"/>
+        <w:jc w:val="both"/>
+        <w:rPr>
+          <w:color w:val="000000" w:themeColor="text1"/>
+        </w:rPr>
+      </w:pPr>
+      <w:r>
+        <w:rPr>
+          <w:color w:val="000000" w:themeColor="text1"/>
+        </w:rPr>
+        <w:t xml:space="preserve">  colours (green, yellow and red) are controlled to light in real-time </w:t>
+      </w:r>
+    </w:p>
+    <w:p>
+      <w:pPr>
+        <w:spacing w:line="259" w:lineRule="auto"/>
+        <w:jc w:val="both"/>
+        <w:rPr>
+          <w:color w:val="000000" w:themeColor="text1"/>
+        </w:rPr>
+      </w:pPr>
+      <w:r>
+        <w:rPr>
+          <w:color w:val="000000" w:themeColor="text1"/>
+        </w:rPr>
+        <w:t xml:space="preserve">  according to the temperature changing speed, to make sure the speed is in</w:t>
+      </w:r>
+    </w:p>
+    <w:p>
+      <w:pPr>
+        <w:spacing w:line="259" w:lineRule="auto"/>
+        <w:jc w:val="both"/>
+        <w:rPr>
+          <w:color w:val="000000" w:themeColor="text1"/>
+        </w:rPr>
+      </w:pPr>
+      <w:r>
+        <w:rPr>
+          <w:color w:val="000000" w:themeColor="text1"/>
+        </w:rPr>
+        <w:t xml:space="preserve">  comfort range. When the speed is in the range -4 °C/min to 4 °C/min, </w:t>
+      </w:r>
+    </w:p>
+    <w:p>
+      <w:pPr>
+        <w:spacing w:line="259" w:lineRule="auto"/>
+        <w:jc w:val="both"/>
+        <w:rPr>
+          <w:color w:val="000000" w:themeColor="text1"/>
+        </w:rPr>
+      </w:pPr>
+      <w:r>
+        <w:rPr>
+          <w:color w:val="000000" w:themeColor="text1"/>
+        </w:rPr>
+        <w:t xml:space="preserve">  the green LED will light constantly. The yellow LED will light while </w:t>
+      </w:r>
+    </w:p>
+    <w:p>
+      <w:pPr>
+        <w:spacing w:line="259" w:lineRule="auto"/>
+        <w:jc w:val="both"/>
+        <w:rPr>
+          <w:color w:val="000000" w:themeColor="text1"/>
+        </w:rPr>
+      </w:pPr>
+      <w:r>
+        <w:rPr>
+          <w:color w:val="000000" w:themeColor="text1"/>
+        </w:rPr>
+        <w:t xml:space="preserve">  speed is lower and the red LED will light while speed is above the range</w:t>
+      </w:r>
+    </w:p>
+    <w:p>
+      <w:pPr>
+        <w:spacing w:line="259" w:lineRule="auto"/>
+        <w:jc w:val="both"/>
+        <w:rPr>
+          <w:color w:val="000000" w:themeColor="text1"/>
           <w:highlight w:val="cyan"/>
         </w:rPr>
       </w:pPr>
     </w:p>
+    <w:p>
+      <w:pPr>
+        <w:rPr>
+          <w:b/>
+          <w:bCs/>
+        </w:rPr>
+      </w:pPr>
+      <w:r>
+        <w:rPr>
+          <w:rFonts w:hint="eastAsia"/>
+          <w:b/>
+          <w:bCs/>
+        </w:rPr>
+        <w:t xml:space="preserve">Task </w:t>
+      </w:r>
+      <w:r>
+        <w:rPr>
+          <w:b/>
+          <w:bCs/>
+        </w:rPr>
+        <w:t>4</w:t>
+      </w:r>
+    </w:p>
+    <w:p>
+      <w:pPr>
+        <w:spacing w:line="259" w:lineRule="auto"/>
+        <w:jc w:val="both"/>
+        <w:rPr>
+          <w:color w:val="000000" w:themeColor="text1"/>
+        </w:rPr>
+      </w:pPr>
+      <w:r>
+        <w:rPr>
+          <w:color w:val="000000" w:themeColor="text1"/>
+        </w:rPr>
+        <w:t>Reflective statement</w:t>
+      </w:r>
+    </w:p>
+    <w:p>
+      <w:pPr>
+        <w:spacing w:line="259" w:lineRule="auto"/>
+        <w:jc w:val="both"/>
+        <w:rPr>
+          <w:color w:val="000000" w:themeColor="text1"/>
+        </w:rPr>
+      </w:pPr>
+      <w:r>
+        <w:rPr>
+          <w:color w:val="000000" w:themeColor="text1"/>
+        </w:rPr>
+        <w:t>Challenges: During this project, the breadboard and Arduino with some other new electronics element components such as thermistor were used throughout. Learning the connecting method and bringing into practice was</w:t>
+      </w:r>
+      <w:r>
+        <w:rPr>
+          <w:color w:val="000000" w:themeColor="text1"/>
+        </w:rPr>
+        <w:t xml:space="preserve"> </w:t>
+      </w:r>
+      <w:r>
+        <w:rPr>
+          <w:color w:val="000000" w:themeColor="text1"/>
+        </w:rPr>
+        <w:t>the main challenge. Otherwise, linking MATLAB to GitHub and updating local files were also new elements, which could be considered as other challenges.</w:t>
+      </w:r>
+    </w:p>
+    <w:p>
+      <w:pPr>
+        <w:spacing w:line="259" w:lineRule="auto"/>
+        <w:jc w:val="both"/>
+        <w:rPr>
+          <w:color w:val="000000" w:themeColor="text1"/>
+        </w:rPr>
+      </w:pPr>
+      <w:r>
+        <w:rPr>
+          <w:color w:val="000000" w:themeColor="text1"/>
+        </w:rPr>
+        <w:t>Strengths: It could be easy to get temperature data just use these</w:t>
+      </w:r>
+      <w:r>
+        <w:rPr>
+          <w:color w:val="000000" w:themeColor="text1"/>
+        </w:rPr>
+        <w:t xml:space="preserve"> </w:t>
+      </w:r>
+      <w:r>
+        <w:rPr>
+          <w:color w:val="000000" w:themeColor="text1"/>
+        </w:rPr>
+        <w:t>electronics components with MATLAB fundamental coding, the implementation</w:t>
+      </w:r>
+      <w:r>
+        <w:rPr>
+          <w:color w:val="000000" w:themeColor="text1"/>
+        </w:rPr>
+        <w:t xml:space="preserve"> </w:t>
+      </w:r>
+      <w:r>
+        <w:rPr>
+          <w:color w:val="000000" w:themeColor="text1"/>
+        </w:rPr>
+        <w:t>of controlling 3 different colours of LEDs could make the temperature</w:t>
+      </w:r>
+      <w:r>
+        <w:rPr>
+          <w:color w:val="000000" w:themeColor="text1"/>
+        </w:rPr>
+        <w:t xml:space="preserve"> </w:t>
+      </w:r>
+      <w:r>
+        <w:rPr>
+          <w:color w:val="000000" w:themeColor="text1"/>
+        </w:rPr>
+        <w:t>range and changing speed detected. The green LED always represented for a</w:t>
+      </w:r>
+      <w:r>
+        <w:rPr>
+          <w:color w:val="000000" w:themeColor="text1"/>
+        </w:rPr>
+        <w:t xml:space="preserve"> </w:t>
+      </w:r>
+      <w:r>
+        <w:rPr>
+          <w:color w:val="000000" w:themeColor="text1"/>
+        </w:rPr>
+        <w:t>no</w:t>
+      </w:r>
+      <w:r>
+        <w:rPr>
+          <w:color w:val="000000" w:themeColor="text1"/>
+        </w:rPr>
+        <w:t>r</w:t>
+      </w:r>
+      <w:r>
+        <w:rPr>
+          <w:color w:val="000000" w:themeColor="text1"/>
+        </w:rPr>
+        <w:t>mal and comfort condition for both temperature and changing speed,</w:t>
+      </w:r>
+      <w:r>
+        <w:rPr>
+          <w:color w:val="000000" w:themeColor="text1"/>
+        </w:rPr>
+        <w:t xml:space="preserve"> </w:t>
+      </w:r>
+      <w:r>
+        <w:rPr>
+          <w:color w:val="000000" w:themeColor="text1"/>
+        </w:rPr>
+        <w:t>while red LED represented for higher values and yellow LED represented</w:t>
+      </w:r>
+      <w:r>
+        <w:rPr>
+          <w:color w:val="000000" w:themeColor="text1"/>
+        </w:rPr>
+        <w:t xml:space="preserve"> </w:t>
+      </w:r>
+      <w:r>
+        <w:rPr>
+          <w:color w:val="000000" w:themeColor="text1"/>
+        </w:rPr>
+        <w:t>for lower values than the comfort range. And this project could be used</w:t>
+      </w:r>
+      <w:r>
+        <w:rPr>
+          <w:color w:val="000000" w:themeColor="text1"/>
+        </w:rPr>
+        <w:t xml:space="preserve"> </w:t>
+      </w:r>
+      <w:r>
+        <w:rPr>
+          <w:color w:val="000000" w:themeColor="text1"/>
+        </w:rPr>
+        <w:t>for both real-time detection and real-time prediction.</w:t>
+      </w:r>
+    </w:p>
+    <w:p>
+      <w:pPr>
+        <w:spacing w:line="259" w:lineRule="auto"/>
+        <w:jc w:val="both"/>
+        <w:rPr>
+          <w:color w:val="000000" w:themeColor="text1"/>
+        </w:rPr>
+      </w:pPr>
+      <w:r>
+        <w:rPr>
+          <w:color w:val="000000" w:themeColor="text1"/>
+        </w:rPr>
+        <w:t>Limitations: In relative concentrated time at normal location, the actual real-time temperature usually does not have significant change. To ensure</w:t>
+      </w:r>
+      <w:r>
+        <w:rPr>
+          <w:color w:val="000000" w:themeColor="text1"/>
+        </w:rPr>
+        <w:t xml:space="preserve"> </w:t>
+      </w:r>
+      <w:r>
+        <w:rPr>
+          <w:color w:val="000000" w:themeColor="text1"/>
+        </w:rPr>
+        <w:t>the project could be programming normally, the temperature should be</w:t>
+      </w:r>
+      <w:r>
+        <w:rPr>
+          <w:color w:val="000000" w:themeColor="text1"/>
+        </w:rPr>
+        <w:t xml:space="preserve"> </w:t>
+      </w:r>
+      <w:r>
+        <w:rPr>
+          <w:color w:val="000000" w:themeColor="text1"/>
+        </w:rPr>
+        <w:t>changed manually such as holding the temperature sensor in hand or moving</w:t>
+      </w:r>
+      <w:r>
+        <w:rPr>
+          <w:color w:val="000000" w:themeColor="text1"/>
+        </w:rPr>
+        <w:t xml:space="preserve"> </w:t>
+      </w:r>
+      <w:r>
+        <w:rPr>
+          <w:color w:val="000000" w:themeColor="text1"/>
+        </w:rPr>
+        <w:t>close to a window to make the temperature increase or decrease. However,</w:t>
+      </w:r>
+      <w:r>
+        <w:rPr>
+          <w:color w:val="000000" w:themeColor="text1"/>
+        </w:rPr>
+        <w:t xml:space="preserve"> </w:t>
+      </w:r>
+      <w:r>
+        <w:rPr>
+          <w:color w:val="000000" w:themeColor="text1"/>
+        </w:rPr>
+        <w:t>even without interference, sometimes the real-time temperature displayed abnormally, the temperature was detected to be constant without any little change or with significant change such as from approximate 20 °C</w:t>
+      </w:r>
+      <w:r>
+        <w:rPr>
+          <w:color w:val="000000" w:themeColor="text1"/>
+        </w:rPr>
+        <w:t xml:space="preserve"> </w:t>
+      </w:r>
+      <w:r>
+        <w:rPr>
+          <w:color w:val="000000" w:themeColor="text1"/>
+        </w:rPr>
+        <w:t>to 40 °C. After a moment, with same connection and code the temperature</w:t>
+      </w:r>
+      <w:r>
+        <w:rPr>
+          <w:color w:val="000000" w:themeColor="text1"/>
+        </w:rPr>
+        <w:t xml:space="preserve"> </w:t>
+      </w:r>
+      <w:r>
+        <w:rPr>
+          <w:color w:val="000000" w:themeColor="text1"/>
+        </w:rPr>
+        <w:t>was detected to be normal. It is shown that the system is unstable.</w:t>
+      </w:r>
+    </w:p>
+    <w:p>
+      <w:pPr>
+        <w:spacing w:line="259" w:lineRule="auto"/>
+        <w:jc w:val="both"/>
+        <w:rPr>
+          <w:color w:val="000000" w:themeColor="text1"/>
+        </w:rPr>
+      </w:pPr>
+      <w:r>
+        <w:rPr>
+          <w:color w:val="000000" w:themeColor="text1"/>
+        </w:rPr>
+        <w:t>Suggested future improvements: May use more stable and precise</w:t>
+      </w:r>
+      <w:r>
+        <w:rPr>
+          <w:color w:val="000000" w:themeColor="text1"/>
+        </w:rPr>
+        <w:t xml:space="preserve"> </w:t>
+      </w:r>
+      <w:r>
+        <w:rPr>
+          <w:color w:val="000000" w:themeColor="text1"/>
+        </w:rPr>
+        <w:t>electronics components to improve the stability. The different LEDs light</w:t>
+      </w:r>
+      <w:r>
+        <w:rPr>
+          <w:color w:val="000000" w:themeColor="text1"/>
+        </w:rPr>
+        <w:t xml:space="preserve"> </w:t>
+      </w:r>
+      <w:r>
+        <w:rPr>
+          <w:color w:val="000000" w:themeColor="text1"/>
+        </w:rPr>
+        <w:t>to alert could also combined with sound probably and it is feasible</w:t>
+      </w:r>
+      <w:r>
+        <w:rPr>
+          <w:color w:val="000000" w:themeColor="text1"/>
+        </w:rPr>
+        <w:t xml:space="preserve"> </w:t>
+      </w:r>
+      <w:r>
+        <w:rPr>
+          <w:color w:val="000000" w:themeColor="text1"/>
+        </w:rPr>
+        <w:t>through MATLAB coding.</w:t>
+      </w:r>
+    </w:p>
     <w:sectPr>
-      <w:headerReference w:type="default" r:id="rId9"/>
-      <w:footerReference w:type="default" r:id="rId10"/>
-      <w:headerReference w:type="first" r:id="rId11"/>
-      <w:footerReference w:type="first" r:id="rId12"/>
+      <w:headerReference w:type="default" r:id="rId20"/>
+      <w:footerReference w:type="default" r:id="rId21"/>
+      <w:headerReference w:type="first" r:id="rId22"/>
+      <w:footerReference w:type="first" r:id="rId23"/>
       <w:pgSz w:w="11906" w:h="16838"/>
       <w:pgMar w:top="1440" w:right="1440" w:bottom="1440" w:left="1440" w:header="850" w:footer="708" w:gutter="0"/>
       <w:cols w:space="708"/>
@@ -851,7 +2583,7 @@
             </mc:Choice>
             <mc:Fallback>
               <w:pict>
-                <v:line w14:anchorId="68CAF598" id="Straight Connector 4" o:spid="_x0000_s1026" style="position:absolute;z-index:251658243;visibility:visible;mso-wrap-style:square;mso-wrap-distance-left:9pt;mso-wrap-distance-top:0;mso-wrap-distance-right:9pt;mso-wrap-distance-bottom:0;mso-position-horizontal:absolute;mso-position-horizontal-relative:text;mso-position-vertical:absolute;mso-position-vertical-relative:text" from="-.75pt,-10.2pt" to="454.5pt,-10.2pt" o:gfxdata="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" strokecolor="#4472c4 [3204]" strokeweight=".5pt">
+                <v:line w14:anchorId="241E4862" id="Straight Connector 4" o:spid="_x0000_s1026" style="position:absolute;z-index:251658243;visibility:visible;mso-wrap-style:square;mso-wrap-distance-left:9pt;mso-wrap-distance-top:0;mso-wrap-distance-right:9pt;mso-wrap-distance-bottom:0;mso-position-horizontal:absolute;mso-position-horizontal-relative:text;mso-position-vertical:absolute;mso-position-vertical-relative:text" from="-.75pt,-10.2pt" to="454.5pt,-10.2pt" o:gfxdata="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" strokecolor="#4472c4 [3204]" strokeweight=".5pt">
                   <v:stroke joinstyle="miter"/>
                 </v:line>
               </w:pict>
@@ -1345,6 +3077,95 @@
     </w:lvl>
   </w:abstractNum>
   <w:abstractNum w:abstractNumId="2" w15:restartNumberingAfterBreak="0">
+    <w:nsid w:val="1D2F3B15"/>
+    <w:multiLevelType w:val="hybridMultilevel"/>
+    <w:tmpl w:val="044C24BC"/>
+    <w:lvl w:ilvl="0" w:tplc="08090017">
+      <w:start w:val="1"/>
+      <w:numFmt w:val="lowerLetter"/>
+      <w:lvlText w:val="%1)"/>
+      <w:lvlJc w:val="left"/>
+      <w:pPr>
+        <w:ind w:left="720" w:hanging="360"/>
+      </w:pPr>
+      <w:rPr>
+        <w:rFonts w:hint="default"/>
+      </w:rPr>
+    </w:lvl>
+    <w:lvl w:ilvl="1" w:tplc="08090019" w:tentative="1">
+      <w:start w:val="1"/>
+      <w:numFmt w:val="lowerLetter"/>
+      <w:lvlText w:val="%2."/>
+      <w:lvlJc w:val="left"/>
+      <w:pPr>
+        <w:ind w:left="1440" w:hanging="360"/>
+      </w:pPr>
+    </w:lvl>
+    <w:lvl w:ilvl="2" w:tplc="0809001B" w:tentative="1">
+      <w:start w:val="1"/>
+      <w:numFmt w:val="lowerRoman"/>
+      <w:lvlText w:val="%3."/>
+      <w:lvlJc w:val="right"/>
+      <w:pPr>
+        <w:ind w:left="2160" w:hanging="180"/>
+      </w:pPr>
+    </w:lvl>
+    <w:lvl w:ilvl="3" w:tplc="0809000F" w:tentative="1">
+      <w:start w:val="1"/>
+      <w:numFmt w:val="decimal"/>
+      <w:lvlText w:val="%4."/>
+      <w:lvlJc w:val="left"/>
+      <w:pPr>
+        <w:ind w:left="2880" w:hanging="360"/>
+      </w:pPr>
+    </w:lvl>
+    <w:lvl w:ilvl="4" w:tplc="08090019" w:tentative="1">
+      <w:start w:val="1"/>
+      <w:numFmt w:val="lowerLetter"/>
+      <w:lvlText w:val="%5."/>
+      <w:lvlJc w:val="left"/>
+      <w:pPr>
+        <w:ind w:left="3600" w:hanging="360"/>
+      </w:pPr>
+    </w:lvl>
+    <w:lvl w:ilvl="5" w:tplc="0809001B" w:tentative="1">
+      <w:start w:val="1"/>
+      <w:numFmt w:val="lowerRoman"/>
+      <w:lvlText w:val="%6."/>
+      <w:lvlJc w:val="right"/>
+      <w:pPr>
+        <w:ind w:left="4320" w:hanging="180"/>
+      </w:pPr>
+    </w:lvl>
+    <w:lvl w:ilvl="6" w:tplc="0809000F" w:tentative="1">
+      <w:start w:val="1"/>
+      <w:numFmt w:val="decimal"/>
+      <w:lvlText w:val="%7."/>
+      <w:lvlJc w:val="left"/>
+      <w:pPr>
+        <w:ind w:left="5040" w:hanging="360"/>
+      </w:pPr>
+    </w:lvl>
+    <w:lvl w:ilvl="7" w:tplc="08090019" w:tentative="1">
+      <w:start w:val="1"/>
+      <w:numFmt w:val="lowerLetter"/>
+      <w:lvlText w:val="%8."/>
+      <w:lvlJc w:val="left"/>
+      <w:pPr>
+        <w:ind w:left="5760" w:hanging="360"/>
+      </w:pPr>
+    </w:lvl>
+    <w:lvl w:ilvl="8" w:tplc="0809001B" w:tentative="1">
+      <w:start w:val="1"/>
+      <w:numFmt w:val="lowerRoman"/>
+      <w:lvlText w:val="%9."/>
+      <w:lvlJc w:val="right"/>
+      <w:pPr>
+        <w:ind w:left="6480" w:hanging="180"/>
+      </w:pPr>
+    </w:lvl>
+  </w:abstractNum>
+  <w:abstractNum w:abstractNumId="3" w15:restartNumberingAfterBreak="0">
     <w:nsid w:val="31287870"/>
     <w:multiLevelType w:val="hybridMultilevel"/>
     <w:tmpl w:val="CF7089F8"/>
@@ -1433,7 +3254,96 @@
       </w:pPr>
     </w:lvl>
   </w:abstractNum>
-  <w:abstractNum w:abstractNumId="3" w15:restartNumberingAfterBreak="0">
+  <w:abstractNum w:abstractNumId="4" w15:restartNumberingAfterBreak="0">
+    <w:nsid w:val="33D24C6D"/>
+    <w:multiLevelType w:val="hybridMultilevel"/>
+    <w:tmpl w:val="D8C6DD38"/>
+    <w:lvl w:ilvl="0" w:tplc="08090017">
+      <w:start w:val="1"/>
+      <w:numFmt w:val="lowerLetter"/>
+      <w:lvlText w:val="%1)"/>
+      <w:lvlJc w:val="left"/>
+      <w:pPr>
+        <w:ind w:left="720" w:hanging="360"/>
+      </w:pPr>
+      <w:rPr>
+        <w:rFonts w:hint="default"/>
+      </w:rPr>
+    </w:lvl>
+    <w:lvl w:ilvl="1" w:tplc="08090019" w:tentative="1">
+      <w:start w:val="1"/>
+      <w:numFmt w:val="lowerLetter"/>
+      <w:lvlText w:val="%2."/>
+      <w:lvlJc w:val="left"/>
+      <w:pPr>
+        <w:ind w:left="1440" w:hanging="360"/>
+      </w:pPr>
+    </w:lvl>
+    <w:lvl w:ilvl="2" w:tplc="0809001B" w:tentative="1">
+      <w:start w:val="1"/>
+      <w:numFmt w:val="lowerRoman"/>
+      <w:lvlText w:val="%3."/>
+      <w:lvlJc w:val="right"/>
+      <w:pPr>
+        <w:ind w:left="2160" w:hanging="180"/>
+      </w:pPr>
+    </w:lvl>
+    <w:lvl w:ilvl="3" w:tplc="0809000F" w:tentative="1">
+      <w:start w:val="1"/>
+      <w:numFmt w:val="decimal"/>
+      <w:lvlText w:val="%4."/>
+      <w:lvlJc w:val="left"/>
+      <w:pPr>
+        <w:ind w:left="2880" w:hanging="360"/>
+      </w:pPr>
+    </w:lvl>
+    <w:lvl w:ilvl="4" w:tplc="08090019" w:tentative="1">
+      <w:start w:val="1"/>
+      <w:numFmt w:val="lowerLetter"/>
+      <w:lvlText w:val="%5."/>
+      <w:lvlJc w:val="left"/>
+      <w:pPr>
+        <w:ind w:left="3600" w:hanging="360"/>
+      </w:pPr>
+    </w:lvl>
+    <w:lvl w:ilvl="5" w:tplc="0809001B" w:tentative="1">
+      <w:start w:val="1"/>
+      <w:numFmt w:val="lowerRoman"/>
+      <w:lvlText w:val="%6."/>
+      <w:lvlJc w:val="right"/>
+      <w:pPr>
+        <w:ind w:left="4320" w:hanging="180"/>
+      </w:pPr>
+    </w:lvl>
+    <w:lvl w:ilvl="6" w:tplc="0809000F" w:tentative="1">
+      <w:start w:val="1"/>
+      <w:numFmt w:val="decimal"/>
+      <w:lvlText w:val="%7."/>
+      <w:lvlJc w:val="left"/>
+      <w:pPr>
+        <w:ind w:left="5040" w:hanging="360"/>
+      </w:pPr>
+    </w:lvl>
+    <w:lvl w:ilvl="7" w:tplc="08090019" w:tentative="1">
+      <w:start w:val="1"/>
+      <w:numFmt w:val="lowerLetter"/>
+      <w:lvlText w:val="%8."/>
+      <w:lvlJc w:val="left"/>
+      <w:pPr>
+        <w:ind w:left="5760" w:hanging="360"/>
+      </w:pPr>
+    </w:lvl>
+    <w:lvl w:ilvl="8" w:tplc="0809001B" w:tentative="1">
+      <w:start w:val="1"/>
+      <w:numFmt w:val="lowerRoman"/>
+      <w:lvlText w:val="%9."/>
+      <w:lvlJc w:val="right"/>
+      <w:pPr>
+        <w:ind w:left="6480" w:hanging="180"/>
+      </w:pPr>
+    </w:lvl>
+  </w:abstractNum>
+  <w:abstractNum w:abstractNumId="5" w15:restartNumberingAfterBreak="0">
     <w:nsid w:val="49D82E44"/>
     <w:multiLevelType w:val="multilevel"/>
     <w:tmpl w:val="6B982794"/>
@@ -1521,7 +3431,7 @@
       </w:pPr>
     </w:lvl>
   </w:abstractNum>
-  <w:abstractNum w:abstractNumId="4" w15:restartNumberingAfterBreak="0">
+  <w:abstractNum w:abstractNumId="6" w15:restartNumberingAfterBreak="0">
     <w:nsid w:val="4EC2303B"/>
     <w:multiLevelType w:val="hybridMultilevel"/>
     <w:tmpl w:val="54747496"/>
@@ -1610,7 +3520,7 @@
       </w:pPr>
     </w:lvl>
   </w:abstractNum>
-  <w:abstractNum w:abstractNumId="5" w15:restartNumberingAfterBreak="0">
+  <w:abstractNum w:abstractNumId="7" w15:restartNumberingAfterBreak="0">
     <w:nsid w:val="509A57DD"/>
     <w:multiLevelType w:val="hybridMultilevel"/>
     <w:tmpl w:val="25F4533C"/>
@@ -1723,7 +3633,7 @@
       </w:rPr>
     </w:lvl>
   </w:abstractNum>
-  <w:abstractNum w:abstractNumId="6" w15:restartNumberingAfterBreak="0">
+  <w:abstractNum w:abstractNumId="8" w15:restartNumberingAfterBreak="0">
     <w:nsid w:val="54237D38"/>
     <w:multiLevelType w:val="hybridMultilevel"/>
     <w:tmpl w:val="2828F10A"/>
@@ -1836,7 +3746,185 @@
       </w:rPr>
     </w:lvl>
   </w:abstractNum>
-  <w:abstractNum w:abstractNumId="7" w15:restartNumberingAfterBreak="0">
+  <w:abstractNum w:abstractNumId="9" w15:restartNumberingAfterBreak="0">
+    <w:nsid w:val="5CFC7347"/>
+    <w:multiLevelType w:val="hybridMultilevel"/>
+    <w:tmpl w:val="48A42340"/>
+    <w:lvl w:ilvl="0" w:tplc="9D381538">
+      <w:start w:val="1"/>
+      <w:numFmt w:val="lowerRoman"/>
+      <w:lvlText w:val="%1)"/>
+      <w:lvlJc w:val="left"/>
+      <w:pPr>
+        <w:ind w:left="1080" w:hanging="720"/>
+      </w:pPr>
+      <w:rPr>
+        <w:rFonts w:hint="default"/>
+      </w:rPr>
+    </w:lvl>
+    <w:lvl w:ilvl="1" w:tplc="08090019" w:tentative="1">
+      <w:start w:val="1"/>
+      <w:numFmt w:val="lowerLetter"/>
+      <w:lvlText w:val="%2."/>
+      <w:lvlJc w:val="left"/>
+      <w:pPr>
+        <w:ind w:left="1440" w:hanging="360"/>
+      </w:pPr>
+    </w:lvl>
+    <w:lvl w:ilvl="2" w:tplc="0809001B" w:tentative="1">
+      <w:start w:val="1"/>
+      <w:numFmt w:val="lowerRoman"/>
+      <w:lvlText w:val="%3."/>
+      <w:lvlJc w:val="right"/>
+      <w:pPr>
+        <w:ind w:left="2160" w:hanging="180"/>
+      </w:pPr>
+    </w:lvl>
+    <w:lvl w:ilvl="3" w:tplc="0809000F" w:tentative="1">
+      <w:start w:val="1"/>
+      <w:numFmt w:val="decimal"/>
+      <w:lvlText w:val="%4."/>
+      <w:lvlJc w:val="left"/>
+      <w:pPr>
+        <w:ind w:left="2880" w:hanging="360"/>
+      </w:pPr>
+    </w:lvl>
+    <w:lvl w:ilvl="4" w:tplc="08090019" w:tentative="1">
+      <w:start w:val="1"/>
+      <w:numFmt w:val="lowerLetter"/>
+      <w:lvlText w:val="%5."/>
+      <w:lvlJc w:val="left"/>
+      <w:pPr>
+        <w:ind w:left="3600" w:hanging="360"/>
+      </w:pPr>
+    </w:lvl>
+    <w:lvl w:ilvl="5" w:tplc="0809001B" w:tentative="1">
+      <w:start w:val="1"/>
+      <w:numFmt w:val="lowerRoman"/>
+      <w:lvlText w:val="%6."/>
+      <w:lvlJc w:val="right"/>
+      <w:pPr>
+        <w:ind w:left="4320" w:hanging="180"/>
+      </w:pPr>
+    </w:lvl>
+    <w:lvl w:ilvl="6" w:tplc="0809000F" w:tentative="1">
+      <w:start w:val="1"/>
+      <w:numFmt w:val="decimal"/>
+      <w:lvlText w:val="%7."/>
+      <w:lvlJc w:val="left"/>
+      <w:pPr>
+        <w:ind w:left="5040" w:hanging="360"/>
+      </w:pPr>
+    </w:lvl>
+    <w:lvl w:ilvl="7" w:tplc="08090019" w:tentative="1">
+      <w:start w:val="1"/>
+      <w:numFmt w:val="lowerLetter"/>
+      <w:lvlText w:val="%8."/>
+      <w:lvlJc w:val="left"/>
+      <w:pPr>
+        <w:ind w:left="5760" w:hanging="360"/>
+      </w:pPr>
+    </w:lvl>
+    <w:lvl w:ilvl="8" w:tplc="0809001B" w:tentative="1">
+      <w:start w:val="1"/>
+      <w:numFmt w:val="lowerRoman"/>
+      <w:lvlText w:val="%9."/>
+      <w:lvlJc w:val="right"/>
+      <w:pPr>
+        <w:ind w:left="6480" w:hanging="180"/>
+      </w:pPr>
+    </w:lvl>
+  </w:abstractNum>
+  <w:abstractNum w:abstractNumId="10" w15:restartNumberingAfterBreak="0">
+    <w:nsid w:val="5D171394"/>
+    <w:multiLevelType w:val="hybridMultilevel"/>
+    <w:tmpl w:val="FC88ACCA"/>
+    <w:lvl w:ilvl="0" w:tplc="08090017">
+      <w:start w:val="1"/>
+      <w:numFmt w:val="lowerLetter"/>
+      <w:lvlText w:val="%1)"/>
+      <w:lvlJc w:val="left"/>
+      <w:pPr>
+        <w:ind w:left="720" w:hanging="360"/>
+      </w:pPr>
+      <w:rPr>
+        <w:rFonts w:hint="default"/>
+      </w:rPr>
+    </w:lvl>
+    <w:lvl w:ilvl="1" w:tplc="08090019" w:tentative="1">
+      <w:start w:val="1"/>
+      <w:numFmt w:val="lowerLetter"/>
+      <w:lvlText w:val="%2."/>
+      <w:lvlJc w:val="left"/>
+      <w:pPr>
+        <w:ind w:left="1440" w:hanging="360"/>
+      </w:pPr>
+    </w:lvl>
+    <w:lvl w:ilvl="2" w:tplc="0809001B" w:tentative="1">
+      <w:start w:val="1"/>
+      <w:numFmt w:val="lowerRoman"/>
+      <w:lvlText w:val="%3."/>
+      <w:lvlJc w:val="right"/>
+      <w:pPr>
+        <w:ind w:left="2160" w:hanging="180"/>
+      </w:pPr>
+    </w:lvl>
+    <w:lvl w:ilvl="3" w:tplc="0809000F" w:tentative="1">
+      <w:start w:val="1"/>
+      <w:numFmt w:val="decimal"/>
+      <w:lvlText w:val="%4."/>
+      <w:lvlJc w:val="left"/>
+      <w:pPr>
+        <w:ind w:left="2880" w:hanging="360"/>
+      </w:pPr>
+    </w:lvl>
+    <w:lvl w:ilvl="4" w:tplc="08090019" w:tentative="1">
+      <w:start w:val="1"/>
+      <w:numFmt w:val="lowerLetter"/>
+      <w:lvlText w:val="%5."/>
+      <w:lvlJc w:val="left"/>
+      <w:pPr>
+        <w:ind w:left="3600" w:hanging="360"/>
+      </w:pPr>
+    </w:lvl>
+    <w:lvl w:ilvl="5" w:tplc="0809001B" w:tentative="1">
+      <w:start w:val="1"/>
+      <w:numFmt w:val="lowerRoman"/>
+      <w:lvlText w:val="%6."/>
+      <w:lvlJc w:val="right"/>
+      <w:pPr>
+        <w:ind w:left="4320" w:hanging="180"/>
+      </w:pPr>
+    </w:lvl>
+    <w:lvl w:ilvl="6" w:tplc="0809000F" w:tentative="1">
+      <w:start w:val="1"/>
+      <w:numFmt w:val="decimal"/>
+      <w:lvlText w:val="%7."/>
+      <w:lvlJc w:val="left"/>
+      <w:pPr>
+        <w:ind w:left="5040" w:hanging="360"/>
+      </w:pPr>
+    </w:lvl>
+    <w:lvl w:ilvl="7" w:tplc="08090019" w:tentative="1">
+      <w:start w:val="1"/>
+      <w:numFmt w:val="lowerLetter"/>
+      <w:lvlText w:val="%8."/>
+      <w:lvlJc w:val="left"/>
+      <w:pPr>
+        <w:ind w:left="5760" w:hanging="360"/>
+      </w:pPr>
+    </w:lvl>
+    <w:lvl w:ilvl="8" w:tplc="0809001B" w:tentative="1">
+      <w:start w:val="1"/>
+      <w:numFmt w:val="lowerRoman"/>
+      <w:lvlText w:val="%9."/>
+      <w:lvlJc w:val="right"/>
+      <w:pPr>
+        <w:ind w:left="6480" w:hanging="180"/>
+      </w:pPr>
+    </w:lvl>
+  </w:abstractNum>
+  <w:abstractNum w:abstractNumId="11" w15:restartNumberingAfterBreak="0">
     <w:nsid w:val="603B7FC8"/>
     <w:multiLevelType w:val="hybridMultilevel"/>
     <w:tmpl w:val="9CBC7E36"/>
@@ -1925,7 +4013,7 @@
       </w:pPr>
     </w:lvl>
   </w:abstractNum>
-  <w:abstractNum w:abstractNumId="8" w15:restartNumberingAfterBreak="0">
+  <w:abstractNum w:abstractNumId="12" w15:restartNumberingAfterBreak="0">
     <w:nsid w:val="674C1B9D"/>
     <w:multiLevelType w:val="hybridMultilevel"/>
     <w:tmpl w:val="B406FDBE"/>
@@ -2014,7 +4102,7 @@
       </w:pPr>
     </w:lvl>
   </w:abstractNum>
-  <w:abstractNum w:abstractNumId="9" w15:restartNumberingAfterBreak="0">
+  <w:abstractNum w:abstractNumId="13" w15:restartNumberingAfterBreak="0">
     <w:nsid w:val="725B5067"/>
     <w:multiLevelType w:val="hybridMultilevel"/>
     <w:tmpl w:val="364E9576"/>
@@ -2104,34 +4192,46 @@
     </w:lvl>
   </w:abstractNum>
   <w:num w:numId="1" w16cid:durableId="1827822957">
-    <w:abstractNumId w:val="3"/>
+    <w:abstractNumId w:val="5"/>
   </w:num>
   <w:num w:numId="2" w16cid:durableId="907231765">
     <w:abstractNumId w:val="0"/>
   </w:num>
   <w:num w:numId="3" w16cid:durableId="1932926543">
-    <w:abstractNumId w:val="5"/>
+    <w:abstractNumId w:val="7"/>
   </w:num>
   <w:num w:numId="4" w16cid:durableId="401878016">
+    <w:abstractNumId w:val="8"/>
+  </w:num>
+  <w:num w:numId="5" w16cid:durableId="1427652726">
     <w:abstractNumId w:val="6"/>
   </w:num>
-  <w:num w:numId="5" w16cid:durableId="1427652726">
-    <w:abstractNumId w:val="4"/>
-  </w:num>
   <w:num w:numId="6" w16cid:durableId="1364671667">
-    <w:abstractNumId w:val="7"/>
+    <w:abstractNumId w:val="11"/>
   </w:num>
   <w:num w:numId="7" w16cid:durableId="295839072">
-    <w:abstractNumId w:val="9"/>
+    <w:abstractNumId w:val="13"/>
   </w:num>
   <w:num w:numId="8" w16cid:durableId="902327809">
-    <w:abstractNumId w:val="8"/>
+    <w:abstractNumId w:val="12"/>
   </w:num>
   <w:num w:numId="9" w16cid:durableId="826215049">
     <w:abstractNumId w:val="1"/>
   </w:num>
   <w:num w:numId="10" w16cid:durableId="703753038">
+    <w:abstractNumId w:val="3"/>
+  </w:num>
+  <w:num w:numId="11" w16cid:durableId="1496410221">
+    <w:abstractNumId w:val="4"/>
+  </w:num>
+  <w:num w:numId="12" w16cid:durableId="2059358239">
     <w:abstractNumId w:val="2"/>
+  </w:num>
+  <w:num w:numId="13" w16cid:durableId="1791820822">
+    <w:abstractNumId w:val="10"/>
+  </w:num>
+  <w:num w:numId="14" w16cid:durableId="331297933">
+    <w:abstractNumId w:val="9"/>
   </w:num>
 </w:numbering>
 </file>
@@ -2141,7 +4241,7 @@
   <w:docDefaults>
     <w:rPrDefault>
       <w:rPr>
-        <w:rFonts w:asciiTheme="minorHAnsi" w:eastAsiaTheme="minorHAnsi" w:hAnsiTheme="minorHAnsi" w:cstheme="minorBidi"/>
+        <w:rFonts w:asciiTheme="minorHAnsi" w:eastAsia="SimSun" w:hAnsiTheme="minorHAnsi" w:cstheme="minorBidi"/>
         <w:sz w:val="22"/>
         <w:szCs w:val="22"/>
         <w:lang w:val="en-GB" w:eastAsia="en-US" w:bidi="ar-SA"/>
@@ -2869,6 +4969,30 @@
       <w:color w:val="4472C4" w:themeColor="accent1"/>
     </w:rPr>
   </w:style>
+  <w:style w:type="character" w:styleId="UnresolvedMention">
+    <w:name w:val="Unresolved Mention"/>
+    <w:basedOn w:val="DefaultParagraphFont"/>
+    <w:uiPriority w:val="99"/>
+    <w:semiHidden/>
+    <w:unhideWhenUsed/>
+    <w:rsid w:val="00966DFD"/>
+    <w:rPr>
+      <w:color w:val="605E5C"/>
+      <w:shd w:val="clear" w:color="auto" w:fill="E1DFDD"/>
+    </w:rPr>
+  </w:style>
+  <w:style w:type="character" w:styleId="FollowedHyperlink">
+    <w:name w:val="FollowedHyperlink"/>
+    <w:basedOn w:val="DefaultParagraphFont"/>
+    <w:uiPriority w:val="99"/>
+    <w:semiHidden/>
+    <w:unhideWhenUsed/>
+    <w:rsid w:val="00966DFD"/>
+    <w:rPr>
+      <w:color w:val="954F72" w:themeColor="followedHyperlink"/>
+      <w:u w:val="single"/>
+    </w:rPr>
+  </w:style>
 </w:styles>
 </file>
 

</xml_diff>